<commit_message>
Redesign classroom as a flowing illustrated storybook
Replace obstructive page turns with smooth camera transitions, introduce natural paper whitespace and chapter-specific scenery, and choreograph the opening walk around its narration.

Unify fullscreen blank-area left and right clicks with guarded classroom interactions, preserve all 40 lesson scenes and timings, sync the teacher script, and package optimized offline assets.

Validation: 9 regression tests pass; browser review covers desktop, 4:3 and mobile layouts, persisted classroom edits, timers and focus-mode controls.
</commit_message>
<xml_diff>
--- a/teacher_script.docx
+++ b/teacher_script.docx
@@ -17,7 +17,7 @@
         <w:snapToGrid w:val="0"/>
       </w:pPr>
       <w:r>
-        <w:t>动画同步版</w:t>
+        <w:t>镜头与动画同步版</w:t>
       </w:r>
     </w:p>
     <w:p>
@@ -33,7 +33,7 @@
         <w:snapToGrid w:val="0"/>
       </w:pPr>
       <w:r>
-        <w:t>本稿与HTML的40个状态一一对应。教师沿着画面讲述、停住、回读与推进；学生仍按原课程完成初判、证据阅读、三关阅读卡修复、小组主张和退出卡。开场与结语的新增视觉内容嵌入教师讲解，不增加课堂活动。</w:t>
+        <w:t>本稿与网页课件的40个场景一一对应。教师沿着镜头讲述、停住、回读与推进；学生仍按原课程完成初判、证据阅读、三关阅读卡修复、小组主张和退出卡。开场与结语的视觉内容嵌入教师讲解，不增加课堂活动。文字进入阅读区域后，镜头与点缀保持安静。</w:t>
       </w:r>
     </w:p>
     <w:p>
@@ -1166,7 +1166,7 @@
         <w:snapToGrid w:val="0"/>
       </w:pPr>
       <w:r>
-        <w:t>正式上课前，把浏览器调到实际投影设备，进入封面并试按一次前后翻页。检查长段落在教室后排能否读清，确认键盘焦点不在输入框内。画面里的自填补语、理由与主张都留给真实课堂生成。</w:t>
+        <w:t>正式上课前，下载并完整解压仓库，保留index.html与assets、styles、scripts文件夹的相对位置，用浏览器打开index.html即可离线授课，无需安装或启动服务器。把浏览器调到实际投影设备，试按一次前后推进；检查长段落在教室后排能否读清。画面里的自填补语、理由与主张都留给真实课堂生成。</w:t>
       </w:r>
     </w:p>
     <w:tbl>
@@ -1287,7 +1287,7 @@
               <w:rPr>
                 <w:b w:val="0"/>
               </w:rPr>
-              <w:t>右方向键 或 空格</w:t>
+              <w:t>→、空格或 PageDown</w:t>
             </w:r>
           </w:p>
         </w:tc>
@@ -1320,7 +1320,7 @@
               <w:rPr>
                 <w:b w:val="0"/>
               </w:rPr>
-              <w:t>进入下一状态</w:t>
+              <w:t>进入下一幕</w:t>
             </w:r>
           </w:p>
         </w:tc>
@@ -1359,7 +1359,7 @@
               <w:rPr>
                 <w:b w:val="0"/>
               </w:rPr>
-              <w:t>左方向键</w:t>
+              <w:t>← 或 PageUp</w:t>
             </w:r>
           </w:p>
         </w:tc>
@@ -1392,7 +1392,7 @@
               <w:rPr>
                 <w:b w:val="0"/>
               </w:rPr>
-              <w:t>返回上一状态</w:t>
+              <w:t>返回上一幕</w:t>
             </w:r>
           </w:p>
         </w:tc>
@@ -1536,7 +1536,7 @@
               <w:rPr>
                 <w:b w:val="0"/>
               </w:rPr>
-              <w:t>打开计时控制</w:t>
+              <w:t>开始或暂停计时</w:t>
             </w:r>
           </w:p>
         </w:tc>
@@ -1841,15 +1841,15 @@
         <w:snapToGrid w:val="0"/>
       </w:pPr>
       <w:r>
-        <w:t>课前确认图片、字体和原画均已加载；在离线状态再检查一次开场、原文、两张现实照片和结尾。课堂声音以教师讲述为主；如启用环境声，只保留低音量且能随时关闭。</w:t>
-      </w:r>
-    </w:p>
-    <w:p>
-      <w:pPr>
-        <w:snapToGrid w:val="0"/>
-      </w:pPr>
-      <w:r>
-        <w:t>教师备注和资料属于备课内容。若N打开的面板会出现在投影上，请只在课前查看，课堂使用本稿或独立教师设备。文字输入时先点击相应输入区；输入完成后点击空白处，再使用快捷键。</w:t>
+        <w:t>课前确认本地图片、字体和原画均已加载；在离线状态再检查一次开场、原文、两张现实照片和结尾。课堂声音以教师讲述为主；如开启轻微音效，保持低音量并确认能随时关闭。</w:t>
+      </w:r>
+    </w:p>
+    <w:p>
+      <w:pPr>
+        <w:snapToGrid w:val="0"/>
+      </w:pPr>
+      <w:r>
+        <w:t>教师备注和资料属于备课内容。若N打开的面板会出现在投影上，请只在课前查看，课堂使用本稿或独立教师设备。全屏时，空白处左键与右键都推进下一幕；按钮、输入区、选中文字及已打开的面板保留各自操作。输入完成后可用控制栏推进，避免误点空白处。普通窗口模式下，空白处点击不推进。浏览器不支持页面全屏时会进入专注模式，点击规则相同，可再按F11隐藏浏览器边框。</w:t>
       </w:r>
     </w:p>
     <w:p>
@@ -1919,7 +1919,7 @@
         <w:t xml:space="preserve">画面与操作  </w:t>
       </w:r>
       <w:r>
-        <w:t>课前停在封面，检查投影边缘与文字大小。学生就绪后按右方向键或空格进入校园小路，开始计时。</w:t>
+        <w:t>课前停在手绘画本的封面，检查投影边缘与文字大小。学生就绪后按右方向键或空格进入校园小路；全屏时也可点击无交互控件的空白处或使用右键推进。封面文字周围保留纸面留白，不提前展示结论。</w:t>
       </w:r>
     </w:p>
     <w:p>
@@ -2011,7 +2011,7 @@
         <w:t xml:space="preserve">画面与操作  </w:t>
       </w:r>
       <w:r>
-        <w:t>小人沿校园小路行走，镜头保持缓慢跟随的感觉；先看见小路和树影，再看见远处的同伴。行走约16秒后停步，不循环播放。</w:t>
+        <w:t>镜头沿校园小路缓慢跟随孩子。书包随步伐轻晃，随后依次看见等候的朋友、追球的孩子与摇动的树影，人物经过这些场景时有相应停步或回应。整个镜头约18秒，行走约16秒后停住，不循环；按旁白顺序让细节进入视野。</w:t>
       </w:r>
     </w:p>
     <w:p>
@@ -2095,7 +2095,7 @@
         <w:t xml:space="preserve">画面与操作  </w:t>
       </w:r>
       <w:r>
-        <w:t>小人从小路进入书桌旁，坐下看作业，手停在纸上，肩膀稍微放低。桌面暖光保留，远处校园色彩渐淡。</w:t>
+        <w:t>镜头从小路平稳进入书桌旁，小人坐下看作业，手停在纸上，肩膀稍微放低。桌面暖光保留，纸张、铅笔与窗边细节围出中央留白，“快乐是真的，烦恼也是真的”在留白处落定。</w:t>
       </w:r>
     </w:p>
     <w:p>
@@ -2179,7 +2179,7 @@
         <w:t xml:space="preserve">画面与操作  </w:t>
       </w:r>
       <w:r>
-        <w:t>小人站起走到窗前，两扇窗向外打开。镜头沿窗框中线向前推，前景窗框掠过两侧，现代街景退远，旧木屋进入视野。视角变化约6秒，之后停稳。</w:t>
+        <w:t>小人来到窗前，两扇窗向外打开。镜头沿窗框中线向前推，前景窗框缓缓移出两侧，现代街景退远，旧木屋进入视野。视角变化约6秒，之后停稳；窗框不遮挡后续阅读文字。</w:t>
       </w:r>
     </w:p>
     <w:p>
@@ -2263,7 +2263,7 @@
         <w:t xml:space="preserve">画面与操作  </w:t>
       </w:r>
       <w:r>
-        <w:t>旧木屋里，书封升起并停稳。下一步出现初判问题，再进入两段并读时才翻书。不能同时提前显示阅读结论。</w:t>
+        <w:t>镜头进入旧木屋，书封从桌面缓缓进入视线并停稳。下一步镜头落到纸面留白中的初判问题，再进入两段并读。不能同时提前显示阅读结论。</w:t>
       </w:r>
     </w:p>
     <w:p>
@@ -2341,7 +2341,7 @@
         <w:t xml:space="preserve">画面与操作  </w:t>
       </w:r>
       <w:r>
-        <w:t>保持主问题和初判句式可见。学生书写时不点击答案，不做投票。收一位学生回答后，在1:50前后读出下一屏的默读指令，再进入两段并读。</w:t>
+        <w:t>镜头落定后，主问题与初判句式在中央纸面留白中保持可见，插画退到阅读区域周围。学生书写时不点击答案，不做投票。收一位学生回答后，在1:50前后读出下一屏的默读指令，再进入两段并读。</w:t>
       </w:r>
     </w:p>
     <w:p>
@@ -2433,7 +2433,7 @@
         <w:t xml:space="preserve">画面与操作  </w:t>
       </w:r>
       <w:r>
-        <w:t>这句指令在上一状态1:50—2:00说完。2:00进入展开的双页并启动两分钟计时。左右两段完整可读，背景人物动作停住，教师不提前点亮关键词。</w:t>
+        <w:t>这句指令在上一状态1:50—2:00说完。2:00镜头停在展开的双页阅读面，启动两分钟计时。左右两段完整可读，周围插画与人物动作停住，教师不提前点亮关键词。</w:t>
       </w:r>
     </w:p>
     <w:p>
@@ -2563,7 +2563,7 @@
         <w:t xml:space="preserve">画面与操作  </w:t>
       </w:r>
       <w:r>
-        <w:t>左右原文持续显示。根据学生实际发言点击对应词句标记；没有被学生说到的词不提前全部亮起。比较视图只并列证据，不用天平、分数或胜负动画。最后一次点击让旧书页转向画作。</w:t>
+        <w:t>左右原文持续显示，文字周围保留稳定留白。根据学生实际发言点击对应词句标记；没有被学生说到的词不提前全部亮起。比较视图只并列证据，不用天平、分数或胜负动画。讨论结束后推进，镜头平稳进入画作。</w:t>
       </w:r>
     </w:p>
     <w:p>
@@ -2682,7 +2682,7 @@
         <w:t xml:space="preserve">画面与操作  </w:t>
       </w:r>
       <w:r>
-        <w:t>先完整显示原画，再缓慢放大肩背与纤绳区域，约5秒后停稳。教师可以回到全图。不得改变画中人物动作，也不把某一位纤夫标成外祖父。</w:t>
+        <w:t>镜头先停在完整原画上，再由教师选择肩背或纤绳，让局部缓慢放大并停稳；可以随时回到全图。不得改变画中人物动作，也不把某一位纤夫标成外祖父。</w:t>
       </w:r>
     </w:p>
     <w:p>
@@ -2775,7 +2775,7 @@
         <w:t xml:space="preserve">画面与操作  </w:t>
       </w:r>
       <w:r>
-        <w:t>画作缩回，原文成为主要阅读面。教师根据学生回答分别标出“经历”和“解释”，同时保留“我当时对你太过分了”。不把两类文字自动连成成立的因果。</w:t>
+        <w:t>镜头从画作移向中央阅读面，插画退到边缘，原文保持完整可读。教师根据学生回答分别标出“经历”和“解释”，同时保留“我当时对你太过分了”。不把两类文字自动连成成立的因果。</w:t>
       </w:r>
     </w:p>
     <w:p>
@@ -2868,7 +2868,7 @@
         <w:t xml:space="preserve">画面与操作  </w:t>
       </w:r>
       <w:r>
-        <w:t>两类文字退到背景，关键问句稳定浮现。镜头停住，保留可回看的原文入口。不要接着播放预设答案。</w:t>
+        <w:t>镜头移到相邻的纸面留白，关键问句稳定浮现后停住。需要核对时可用上一幕返回原文。不要接着播放预设答案。</w:t>
       </w:r>
     </w:p>
     <w:p>
@@ -2943,7 +2943,7 @@
         <w:t xml:space="preserve">画面与操作  </w:t>
       </w:r>
       <w:r>
-        <w:t>三张卡依次出现，但只显示任务名，不显示后两关答案。讲完规则后进入第一关；全班留在原座位。教师资料中保留“教师拟写、待检验、非原著引文”的身份说明。</w:t>
+        <w:t>镜头来到阅读卡修复的桌面，三项任务依次落定，只显示任务名，不显示后两关答案。讲完规则后进入第一关；全班留在原座位。教师资料中保留“教师拟写、待检验、非原著引文”的身份说明。</w:t>
       </w:r>
     </w:p>
     <w:p>
@@ -3021,7 +3021,7 @@
         <w:t xml:space="preserve">画面与操作  </w:t>
       </w:r>
       <w:r>
-        <w:t>显示受伤后感受的完整目标片段，启动20秒阅读计时。卡一概括暂不抢占阅读区域。</w:t>
+        <w:t>镜头停在中央纸面，显示受伤后感受的完整目标片段，启动20秒阅读计时。卡一概括暂不抢占阅读区域，周围点缀保持静止。</w:t>
       </w:r>
     </w:p>
     <w:p>
@@ -3090,7 +3090,7 @@
         <w:t xml:space="preserve">画面与操作  </w:t>
       </w:r>
       <w:r>
-        <w:t>原文被纸页轻轻遮住，保持稳定留白，只留简短记录提示。</w:t>
+        <w:t>镜头平稳移向相邻留白，原文退出当前视野，只留下简短记录提示。文字落定后保持静止，不用翻页遮挡学生的视线。</w:t>
       </w:r>
     </w:p>
     <w:p>
@@ -3177,7 +3177,7 @@
         <w:t xml:space="preserve">画面与操作  </w:t>
       </w:r>
       <w:r>
-        <w:t>重新显示原文并持续保留。学生报出词语后，教师点击相应词语划线；在补语输入处写学生的实际表述。允许取消划线、修改补语，不自动填入标准答案。</w:t>
+        <w:t>镜头回到原文与修订区，原文持续保留。学生报出词语后，教师点击相应词语划线；在补语输入处写学生的实际表述。允许取消划线、修改补语，不自动填入标准答案。完成时只让局部书签作回应。</w:t>
       </w:r>
     </w:p>
     <w:p>
@@ -3264,7 +3264,7 @@
         <w:t xml:space="preserve">画面与操作  </w:t>
       </w:r>
       <w:r>
-        <w:t>第二关显示外祖父受辱、熬出头及解释殴打的相关原句。启动20秒计时，因果线暂不显示。</w:t>
+        <w:t>第二关的原句进入中央阅读面，显示外祖父受辱、熬出头及解释殴打的文字。启动20秒计时，因果线暂不显示，镜头与点缀保持静止。</w:t>
       </w:r>
     </w:p>
     <w:p>
@@ -3333,7 +3333,7 @@
         <w:t xml:space="preserve">画面与操作  </w:t>
       </w:r>
       <w:r>
-        <w:t>原文隐去，留下记录提示。不要在此时透露哪一条箭头要剪断。</w:t>
+        <w:t>镜头移向留白，原文退出当前视野，留下记录提示。不要在此时透露哪一条箭头要剪断。</w:t>
       </w:r>
     </w:p>
     <w:p>
@@ -3416,7 +3416,7 @@
         <w:t xml:space="preserve">画面与操作  </w:t>
       </w:r>
       <w:r>
-        <w:t>显示三节点因果线与原文。依据学生回答点击箭头，使其断开；再次点击可恢复。节点保持原位，不能因箭头断开而抹掉经历。理由输入框记录学生实际表达，至少检验最后一条箭头。</w:t>
+        <w:t>镜头落定后同时显示三节点因果线与原文。依据学生回答点击箭头，使铅笔线断开；再次点击可恢复。节点保持原位，不能因箭头断开而抹掉经历。理由输入框记录学生实际表达，至少检验最后一条箭头。</w:t>
       </w:r>
     </w:p>
     <w:p>
@@ -3503,7 +3503,7 @@
         <w:t xml:space="preserve">画面与操作  </w:t>
       </w:r>
       <w:r>
-        <w:t>显示小茨冈挡打、少挨几下与“为了爱”的上半段。后文保持未揭示状态。启动30秒计时。</w:t>
+        <w:t>中央阅读面显示小茨冈挡打、少挨几下与“为了爱”的上半段。后文保持未揭示状态。启动30秒计时，阅读过程中镜头与人物保持静止。</w:t>
       </w:r>
     </w:p>
     <w:p>
@@ -3572,7 +3572,7 @@
         <w:t xml:space="preserve">画面与操作  </w:t>
       </w:r>
       <w:r>
-        <w:t>上半段隐去，保留动作记录提示。</w:t>
+        <w:t>镜头移向留白，上半段退出当前视野，保留动作记录提示，文字落定后保持静止。</w:t>
       </w:r>
     </w:p>
     <w:p>
@@ -3655,7 +3655,7 @@
         <w:t xml:space="preserve">画面与操作  </w:t>
       </w:r>
       <w:r>
-        <w:t>原文再现。先让学生完成修订；根据其证据，再点亮“挡着”“少挨了几下”“为了爱”等相应词语。小茨冈保持挡在孩子身前的保护姿态，暖光只照亮两人的联系，环境阴影仍然存在。</w:t>
+        <w:t>原文与修订区重新进入中央视野。先让学生完成修订；根据其证据，再点亮“挡着”“少挨了几下”“为了爱”等相应词语。小茨冈在边缘保持挡在孩子身前的保护姿态，暖光只照亮两人的联系，环境阴影仍然存在。</w:t>
       </w:r>
     </w:p>
     <w:p>
@@ -3748,7 +3748,7 @@
         <w:t xml:space="preserve">画面与操作  </w:t>
       </w:r>
       <w:r>
-        <w:t>第三张卡完成后先停住，暖光不熄灭。书页下部展开，先露出“下次再打你”与孩子的问句；回答仍未出现。</w:t>
+        <w:t>第三张卡完成后先停住，暖光不熄灭。镜头移向相邻的对话留白，先露出“下次再打你”与孩子的问句；回答仍未出现。保护者留在阅读区域之外。</w:t>
       </w:r>
     </w:p>
     <w:p>
@@ -3835,7 +3835,7 @@
         <w:t xml:space="preserve">画面与操作  </w:t>
       </w:r>
       <w:r>
-        <w:t>教师推进后才显示小茨冈的回答。保护者与暖光留在边缘，远处阴影不消失。让学生并读孩子的疑问与这句回答。</w:t>
+        <w:t>教师推进后才显示小茨冈的回答，镜头平稳停在两句对话上。保护者与暖光留在边缘，远处阴影不消失。让学生并读孩子的疑问与这句回答。</w:t>
       </w:r>
     </w:p>
     <w:p>
@@ -3927,7 +3927,7 @@
         <w:t xml:space="preserve">画面与操作  </w:t>
       </w:r>
       <w:r>
-        <w:t>显示手绘藏身空间与中央背景文字，窄窗留在背景。此幕没有安妮人物动画，教师用讲述交代人物与历史处境。</w:t>
+        <w:t>镜头进入手绘藏身空间，窄窗、书与生活物件退到四周，中央留白呈现背景文字。此幕没有安妮人物动画，教师用讲述交代人物与历史处境；文字落定后保持静止。</w:t>
       </w:r>
     </w:p>
     <w:p>
@@ -4011,7 +4011,7 @@
         <w:t xml:space="preserve">画面与操作  </w:t>
       </w:r>
       <w:r>
-        <w:t>“食物”“衣物”“书报”三张文字纸签依次落定，动作总长不超过6秒。纸签代表实际帮助，画面不展示实物递送动画；窄窗仍在背景。</w:t>
+        <w:t>手绘食物包裹、衣物与书报依次轻轻落定，旁边保留清楚的文字名称，动作总长不超过6秒。窄窗仍在背景，中央文字说明帮助的价值与仍然缺少的自由，随后画面停住。</w:t>
       </w:r>
     </w:p>
     <w:p>
@@ -4102,7 +4102,7 @@
         <w:t xml:space="preserve">画面与操作  </w:t>
       </w:r>
       <w:r>
-        <w:t>日记文字稳定显示。骑车、跳舞、吹口哨等以玻璃上的轻淡剪影出现；安妮仍在室内，不真的跨出窗。读文时动画停止，教师按学生指认突出相应愿望。</w:t>
+        <w:t>日记文字在中央纸面稳定显示。教师按学生指认突出相应愿望，骑车、跳舞、吹口哨等在文字周围以玻璃上的轻淡剪影作短暂回应，随后停住；这些是愿望，安妮仍在室内，不真的跨出窗。</w:t>
       </w:r>
     </w:p>
     <w:p>
@@ -4201,7 +4201,7 @@
         <w:t xml:space="preserve">画面与操作  </w:t>
       </w:r>
       <w:r>
-        <w:t>愿望剪影退到玻璃边，关键问句出现。教师停顿并口述任务、分工；小组任务和表达支架在下一幕证据总览才显示。进入下一幕后再开始五分钟计时。</w:t>
+        <w:t>镜头从日记移向中央留白，愿望剪影退到玻璃边，关键问句出现后停住。教师停顿并口述任务、分工；小组任务和表达支架在下一幕证据总览才显示。进入下一幕后再开始五分钟计时。</w:t>
       </w:r>
     </w:p>
     <w:p>
@@ -4287,7 +4287,7 @@
         <w:t xml:space="preserve">画面与操作  </w:t>
       </w:r>
       <w:r>
-        <w:t>27:00进入证据总览，启动五分钟计时。两份来源的证据与表达支架保持可读，点击可放大当前片段并返回总览。学生无需操作设备；教师巡视。</w:t>
+        <w:t>27:00镜头停在完整证据总览，启动五分钟计时。两份来源的证据与表达支架保持可读，点击可放大当前片段，关闭面板后回到总览，计时继续。学生无需操作设备；教师巡视，周围点缀保持静止。</w:t>
       </w:r>
     </w:p>
     <w:p>
@@ -4411,7 +4411,7 @@
         <w:t xml:space="preserve">画面与操作  </w:t>
       </w:r>
       <w:r>
-        <w:t>显示两组主张的空白记录区。教师输入学生实际提出的条件与简短证据，不自动填入“安全”“爱”等预设答案。关键词可以随发言修改；不按立场打分。</w:t>
+        <w:t>镜头落到两组主张的空白记录区。教师输入学生实际提出的条件与简短证据，不自动填入“安全”“爱”等预设答案。关键词可以随发言修改；不按立场打分，文字周围保持稳定留白。</w:t>
       </w:r>
     </w:p>
     <w:p>
@@ -4521,7 +4521,7 @@
         <w:t xml:space="preserve">画面与操作  </w:t>
       </w:r>
       <w:r>
-        <w:t>默读指令已在上一屏讲完。中央书页呈现作者回望，按独立片段排版。先保持未经强调的文字，35:40左右请一人用词解释“为什么值得写”；回答后再突出相应词。最后一句在35:56前后说完，进入修订后不再重复指令。</w:t>
+        <w:t>默读指令已在上一屏讲完。镜头停在中央纸面的作者回望，按独立片段排版，插画退到边缘。先保持未经强调的文字，35:40左右请一人用词解释“为什么值得写”；回答后再突出相应词。最后一句在35:56前后说完，进入修订后不再重复指令。</w:t>
       </w:r>
     </w:p>
     <w:p>
@@ -4608,7 +4608,7 @@
         <w:t xml:space="preserve">画面与操作  </w:t>
       </w:r>
       <w:r>
-        <w:t>回到开头问题，显示“我保留……我补充或修改……依据是……”。画面保持稳定，不弹出教师结论。</w:t>
+        <w:t>镜头回到初判问题所在的留白，显示“我保留……我补充或修改……依据是……”。画面保持稳定，不弹出教师结论。</w:t>
       </w:r>
     </w:p>
     <w:p>
@@ -4677,7 +4677,7 @@
         <w:t xml:space="preserve">画面与操作  </w:t>
       </w:r>
       <w:r>
-        <w:t>小人走进房间，两只透明泡泡里已经可见真实资料照片。教师点击亚门的泡泡，进入第一份资料。</w:t>
+        <w:t>镜头进入房间，两只透明泡泡里已经可见真实资料照片，小人留在一旁。教师点击亚门的泡泡，镜头沿所选泡泡进入第一份资料；也可按下一幕顺序展开。</w:t>
       </w:r>
     </w:p>
     <w:p>
@@ -4746,7 +4746,7 @@
         <w:t xml:space="preserve">画面与操作  </w:t>
       </w:r>
       <w:r>
-        <w:t>第一只泡泡展开为亚门的真实资料画面，图像保持纪实原貌。教师讲述时不叠加虚构年龄或人物对白。看清后按下一步进入瓦尔瓦拉。</w:t>
+        <w:t>镜头从第一只泡泡平稳来到居中的阅读空间，亚门的照片与文字落定后停止移动。图像保持纪实原貌，教师讲述时不叠加虚构年龄或人物对白。看清后按下一步进入瓦尔瓦拉。</w:t>
       </w:r>
     </w:p>
     <w:p>
@@ -4830,7 +4830,7 @@
         <w:t xml:space="preserve">画面与操作  </w:t>
       </w:r>
       <w:r>
-        <w:t>瓦尔瓦拉的文字居中呈现，母女照片在上方辅助识别人。照片本身不是烛光场景；烛光阅读、停电与寒冷来自报道文字，教师结合正文讲述。</w:t>
+        <w:t>镜头移向第二份资料，瓦尔瓦拉的文字居中呈现，母女照片辅助识别人。照片本身不是烛光场景；烛光阅读、停电与寒冷来自报道文字，教师结合正文讲述。照片与文字落定后保持静止。</w:t>
       </w:r>
     </w:p>
     <w:p>
@@ -4914,7 +4914,7 @@
         <w:t xml:space="preserve">画面与操作  </w:t>
       </w:r>
       <w:r>
-        <w:t>泡泡中的图像保留，逐渐退到边缘。灰影向室内逼近，木梁和边界压缩可活动的空间，小人收肩、停步。动作约6秒后停住，压力来自处境，不是把儿童照片砸到小人身上。</w:t>
+        <w:t>镜头回到房间，泡泡中的图像保留并退到边缘。灰影向室内逼近，木梁和边界压缩可活动的空间，小人收肩、停步。中央问句保持可读，动作约6秒后停住；压力来自处境，不是把儿童照片砸到小人身上。</w:t>
       </w:r>
     </w:p>
     <w:p>
@@ -4998,7 +4998,7 @@
         <w:t xml:space="preserve">画面与操作  </w:t>
       </w:r>
       <w:r>
-        <w:t>显示桌前画面、两个日常例子与联系生活的提问。退出卡三个句式在下一幕才出现；教师可以在本幕先口述写作指令，并在38:00前讲完。</w:t>
+        <w:t>镜头平稳回到书桌，纸面中央呈现两个日常例子与联系生活的提问，周围点缀停住。退出卡三个句式在下一幕才出现；教师可以在本幕先口述写作指令，并在38:00前讲完。</w:t>
       </w:r>
     </w:p>
     <w:p>
@@ -5084,7 +5084,7 @@
         <w:t xml:space="preserve">画面与操作  </w:t>
       </w:r>
       <w:r>
-        <w:t>保持三句话提示与静止书桌。启动90秒计时；人物、泡泡、灰影与纸页均停止运动。教师不重播动画，不打开资料面板。</w:t>
+        <w:t>镜头停在三句话提示与静止书桌上，中央纸面保留充分书写提示空间。启动90秒计时；人物、泡泡、灰影与周围点缀均停止运动。教师不重播动画，不打开资料面板。</w:t>
       </w:r>
     </w:p>
     <w:p>
@@ -5153,7 +5153,7 @@
         <w:t xml:space="preserve">画面与操作  </w:t>
       </w:r>
       <w:r>
-        <w:t>确认90秒书写结束后推进。成年人双手进入画面，共同支撑木梁；房间只缓缓恢复一点空间，边缘仍留阴影。动作约6秒，不把所有困难瞬间消除。</w:t>
+        <w:t>确认90秒书写结束后推进，镜头回到房间。成年人双手进入画面，共同支撑木梁；房间只缓缓恢复一点空间，边缘仍留阴影。动作约6秒，不把所有困难瞬间消除。</w:t>
       </w:r>
     </w:p>
     <w:p>
@@ -5222,7 +5222,7 @@
         <w:t xml:space="preserve">画面与操作  </w:t>
       </w:r>
       <w:r>
-        <w:t>镜头回到最初的书桌，一支将滑落的铅笔被一只手接住。小人仍在桌前，窗外留有明暗交接的远景。原结语出现后停住。</w:t>
+        <w:t>镜头回到最初的书桌，一支铅笔缓缓滑向桌边，被伸来的手接住。小人仍在桌前，窗外留有明暗交接的远景。原结语在中央留白处出现后停住，保留最后的安静。</w:t>
       </w:r>
     </w:p>
     <w:p>
@@ -5291,7 +5291,7 @@
         <w:t xml:space="preserve">画面与操作  </w:t>
       </w:r>
       <w:r>
-        <w:t>显示原课后任务：回读一处支持或挑战退出卡判断的原文，写约100—150字批注；未读完者继续原阅读计划。画面可在下课后继续停留。</w:t>
+        <w:t>镜头落到纸面留白中的原课后任务：回读一处支持或挑战退出卡判断的原文，写约100—150字批注；未读完者继续原阅读计划。画面停稳，可在下课后继续停留。</w:t>
       </w:r>
     </w:p>
     <w:p>

</xml_diff>

<commit_message>
Direct lesson animation by narration and remove teacher typing
Record spoken responses with ink and seals, connect the reading tasks with semantic animation, and reveal external stories one at a time before the final gathering.

Keep all 40 scenes, source passages, teacher speech and timings. Update the teacher script and add cue-flow regression coverage.
</commit_message>
<xml_diff>
--- a/teacher_script.docx
+++ b/teacher_script.docx
@@ -1166,7 +1166,7 @@
         <w:snapToGrid w:val="0"/>
       </w:pPr>
       <w:r>
-        <w:t>正式上课前，下载并完整解压仓库，保留index.html与assets、styles、scripts文件夹的相对位置，用浏览器打开index.html即可离线授课，无需安装或启动服务器。把浏览器调到实际投影设备，试按一次前后推进；检查长段落在教室后排能否读清。画面里的自填补语、理由与主张都留给真实课堂生成。</w:t>
+        <w:t>正式上课前，下载并完整解压仓库，保留index.html与assets、styles、scripts文件夹的相对位置，用浏览器打开index.html即可离线授课，无需安装或启动服务器。把浏览器调到实际投影设备，试按前后推进，检查长段落能否读清。学生在阅读本写补语、理由和主张；教师无需在网页打字，讲述与作答后点击，用笔迹和印记象征完成。</w:t>
       </w:r>
     </w:p>
     <w:tbl>
@@ -1320,7 +1320,7 @@
               <w:rPr>
                 <w:b w:val="0"/>
               </w:rPr>
-              <w:t>进入下一幕</w:t>
+              <w:t>先完成本幕步骤，再进入下一幕</w:t>
             </w:r>
           </w:p>
         </w:tc>
@@ -1392,7 +1392,7 @@
               <w:rPr>
                 <w:b w:val="0"/>
               </w:rPr>
-              <w:t>返回上一幕</w:t>
+              <w:t>先退回本幕步骤，再返回上一幕</w:t>
             </w:r>
           </w:p>
         </w:tc>
@@ -1752,7 +1752,7 @@
               <w:rPr>
                 <w:b w:val="0"/>
               </w:rPr>
-              <w:t>重播当前状态的动画</w:t>
+              <w:t>清本幕笔迹，从初始步骤重演</w:t>
             </w:r>
           </w:p>
         </w:tc>
@@ -1849,7 +1849,7 @@
         <w:snapToGrid w:val="0"/>
       </w:pPr>
       <w:r>
-        <w:t>教师备注和资料属于备课内容。若N打开的面板会出现在投影上，请只在课前查看，课堂使用本稿或独立教师设备。全屏时，空白处左键与右键都推进下一幕；按钮、输入区、选中文字及已打开的面板保留各自操作。输入完成后可用控制栏推进，避免误点空白处。普通窗口模式下，空白处点击不推进。浏览器不支持页面全屏时会进入专注模式，点击规则相同，可再按F11隐藏浏览器边框。</w:t>
+        <w:t>教师备注和资料供备课使用；若N面板会投到学生屏幕，请课前查看，课堂使用本稿或独立设备。所有下一步入口规则相同：先完成本幕的记录、展开或收回步骤，再进入下一幕；全屏空白左键与右键也相同。按钮、关键词、选中文字及面板保留各自操作；普通窗口空白点击不推进。回访已完成记录幕保留笔迹；上一可逐步撤回本幕步骤，R清本幕象征笔迹并从初始步骤重演，关键词与箭头保留。目录可清空整节状态，不恢复旧版输入内容。同幕步骤不重置计时，资料不按倒计时自动开关，也不识别语音。浏览器不支持页面全屏时会进入专注模式，点击规则相同，可再按F11隐藏浏览器边框。</w:t>
       </w:r>
     </w:p>
     <w:p>
@@ -2682,7 +2682,7 @@
         <w:t xml:space="preserve">画面与操作  </w:t>
       </w:r>
       <w:r>
-        <w:t>镜头先停在完整原画上，再由教师选择肩背或纤绳，让局部缓慢放大并停稳；可以随时回到全图。不得改变画中人物动作，也不把某一位纤夫标成外祖父。</w:t>
+        <w:t>进入本幕时，画作从书页中展开，先停在完整原画上。教师可选择肩背或纤绳，让局部缓慢放大并停稳，也可回到全图。讲完“把目光接回他的讲述”，按下一步将画作收回书页；再按下一步进入外祖父的原文。不得改变画中人物动作，也不把某一位纤夫标成外祖父。</w:t>
       </w:r>
     </w:p>
     <w:p>
@@ -2775,7 +2775,7 @@
         <w:t xml:space="preserve">画面与操作  </w:t>
       </w:r>
       <w:r>
-        <w:t>镜头从画作移向中央阅读面，插画退到边缘，原文保持完整可读。教师根据学生回答分别标出“经历”和“解释”，同时保留“我当时对你太过分了”。不把两类文字自动连成成立的因果。</w:t>
+        <w:t>画作收回后，镜头落到相邻的中央阅读面，插画退到边缘，原文保持完整可读。教师根据学生回答分别标出“经历”和“解释”，同时保留“我当时对你太过分了”。不把两类文字自动连成成立的因果。</w:t>
       </w:r>
     </w:p>
     <w:p>
@@ -3177,7 +3177,7 @@
         <w:t xml:space="preserve">画面与操作  </w:t>
       </w:r>
       <w:r>
-        <w:t>镜头回到原文与修订区，原文持续保留。学生报出词语后，教师点击相应词语划线；在补语输入处写学生的实际表述。允许取消划线、修改补语，不自动填入标准答案。完成时只让局部书签作回应。</w:t>
+        <w:t>镜头回到原文与修订区，原文持续保留。学生在阅读本补写，报出词语后，教师可点击对应词语划线或取消。讲述与作答完成后，按下一步或“留下这次修订”，让笔迹短线与印记象征本次修订已留下；网页不输入补语、不显示预设答案。再按下一步才进入第二关。</w:t>
       </w:r>
     </w:p>
     <w:p>
@@ -3416,7 +3416,7 @@
         <w:t xml:space="preserve">画面与操作  </w:t>
       </w:r>
       <w:r>
-        <w:t>镜头落定后同时显示三节点因果线与原文。依据学生回答点击箭头，使铅笔线断开；再次点击可恢复。节点保持原位，不能因箭头断开而抹掉经历。理由输入框记录学生实际表达，至少检验最后一条箭头。</w:t>
+        <w:t>镜头落定后同时显示三节点因果线与原文。依据学生回答点击箭头，使铅笔线断开；再次点击可恢复。节点保持原位，至少检验最后一条箭头。学生在阅读本写理由，讨论完成后按下一步或“留下这次修订”，用笔迹短线与印记表示已完成，不代写学生理由。再按下一步才进入第三关。</w:t>
       </w:r>
     </w:p>
     <w:p>
@@ -3655,7 +3655,7 @@
         <w:t xml:space="preserve">画面与操作  </w:t>
       </w:r>
       <w:r>
-        <w:t>原文与修订区重新进入中央视野。先让学生完成修订；根据其证据，再点亮“挡着”“少挨了几下”“为了爱”等相应词语。小茨冈在边缘保持挡在孩子身前的保护姿态，暖光只照亮两人的联系，环境阴影仍然存在。</w:t>
+        <w:t>原文与修订区重新进入中央视野。学生在阅读本写赞美；根据其证据，可点亮“挡着”“少挨了几下”“为了爱”等词语。小茨冈保持保护姿态，暖光照亮两人的联系，环境阴影仍在。讲述与作答完成后，按下一步或“留下这次修订”，以笔迹短线与印记表示完成，不展示预设赞美；再按下一步才揭示后半问句。</w:t>
       </w:r>
     </w:p>
     <w:p>
@@ -4102,7 +4102,7 @@
         <w:t xml:space="preserve">画面与操作  </w:t>
       </w:r>
       <w:r>
-        <w:t>日记文字在中央纸面稳定显示。教师按学生指认突出相应愿望，骑车、跳舞、吹口哨等在文字周围以玻璃上的轻淡剪影作短暂回应，随后停住；这些是愿望，安妮仍在室内，不真的跨出窗。</w:t>
+        <w:t>日记文字先在中央纸面稳定显示，教师可按学生指认突出愿望。静读、朗读与两次指认完成后，按下一步展开骑车、跳舞、吹口哨的轻淡剪影，随后讲“我们刚刚看见的那些活动，现在只映在玻璃上”。剪影短暂运动后停住；这些是愿望，安妮仍在室内。讲述结束再按下一步，进入限制处境的追问。</w:t>
       </w:r>
     </w:p>
     <w:p>
@@ -4411,7 +4411,7 @@
         <w:t xml:space="preserve">画面与操作  </w:t>
       </w:r>
       <w:r>
-        <w:t>镜头落到两组主张的空白记录区。教师输入学生实际提出的条件与简短证据，不自动填入“安全”“爱”等预设答案。关键词可以随发言修改；不按立场打分，文字周围保持稳定留白。</w:t>
+        <w:t>镜头落到两组主张与日常补充的空白记录区。第一组讲完后按下一步，用笔迹同时留下主张与证据的完成痕迹；第二组讲完后再按下一步留下第二组；日常生活补充与圈改完成后，再按下一步留下补充。三步均只显示象征笔迹，不要求教师输入、不代写实际发言，也不预填结论或评分。学生仍在纸上修改主张。讲完转场指令后再按下一步，进入作者回望。</w:t>
       </w:r>
     </w:p>
     <w:p>
@@ -4677,7 +4677,7 @@
         <w:t xml:space="preserve">画面与操作  </w:t>
       </w:r>
       <w:r>
-        <w:t>镜头进入房间，两只透明泡泡里已经可见真实资料照片，小人留在一旁。教师点击亚门的泡泡，镜头沿所选泡泡进入第一份资料；也可按下一幕顺序展开。</w:t>
+        <w:t>镜头进入房间，透明记忆保持封存，小人留在一旁；此时不提前显示两张新闻照片。教师说完本句后按下一步，镜头沿记忆进入亚门资料，照片与报道随进入该幕展开。</w:t>
       </w:r>
     </w:p>
     <w:p>
@@ -4746,7 +4746,7 @@
         <w:t xml:space="preserve">画面与操作  </w:t>
       </w:r>
       <w:r>
-        <w:t>镜头从第一只泡泡平稳来到居中的阅读空间，亚门的照片与文字落定后停止移动。图像保持纪实原貌，教师讲述时不叠加虚构年龄或人物对白。看清后按下一步进入瓦尔瓦拉。</w:t>
+        <w:t>进入本幕时，亚门的照片与报道从记忆中展开，在居中阅读空间落定并停止移动。图像保持纪实原貌，不叠加虚构年龄或人物对白。讲完本句后按下一步，将资料收回透明泡泡；再按下一步才进入并展开瓦尔瓦拉资料。</w:t>
       </w:r>
     </w:p>
     <w:p>
@@ -4830,7 +4830,7 @@
         <w:t xml:space="preserve">画面与操作  </w:t>
       </w:r>
       <w:r>
-        <w:t>镜头移向第二份资料，瓦尔瓦拉的文字居中呈现，母女照片辅助识别人。照片本身不是烛光场景；烛光阅读、停电与寒冷来自报道文字，教师结合正文讲述。照片与文字落定后保持静止。</w:t>
+        <w:t>进入本幕时，瓦尔瓦拉的报道与母女照片展开，落定后保持静止。照片本身不是烛光场景；烛光阅读、停电与寒冷来自报道文字，教师结合正文讲述。讲完本句后按下一步，将资料收回透明泡泡；再按下一步回到安静房间，准备处境汇聚。</w:t>
       </w:r>
     </w:p>
     <w:p>
@@ -4914,7 +4914,7 @@
         <w:t xml:space="preserve">画面与操作  </w:t>
       </w:r>
       <w:r>
-        <w:t>镜头回到房间，泡泡中的图像保留并退到边缘。灰影向室内逼近，木梁和边界压缩可活动的空间，小人收肩、停步。中央问句保持可读，动作约6秒后停住；压力来自处境，不是把儿童照片砸到小人身上。</w:t>
+        <w:t>进入本幕先停在安静房间。讲到“房间一点点变窄”，按下一步，让《童年》、安妮与两份现实材料的记忆同时汇聚，随后灰影逼近、木梁与边界压缩空间，小人收肩停步。中央问句保持可读，整段动作约6秒后停住；压力来自处境，不将儿童照片砸向人物。说完其余旁白、保留短暂停顿后，再按下一步进入日常连接。</w:t>
       </w:r>
     </w:p>
     <w:p>
@@ -5153,7 +5153,7 @@
         <w:t xml:space="preserve">画面与操作  </w:t>
       </w:r>
       <w:r>
-        <w:t>确认90秒书写结束后推进，镜头回到房间。成年人双手进入画面，共同支撑木梁；房间只缓缓恢复一点空间，边缘仍留阴影。动作约6秒，不把所有困难瞬间消除。</w:t>
+        <w:t>确认90秒书写结束后推进，镜头回到房间，支撑动作随入幕自动开始。成年人双手共同支撑木梁；房间只缓缓恢复一点空间，边缘仍留阴影。动作约6秒，与本句旁白同步，不把所有困难瞬间消除。</w:t>
       </w:r>
     </w:p>
     <w:p>
@@ -5222,7 +5222,7 @@
         <w:t xml:space="preserve">画面与操作  </w:t>
       </w:r>
       <w:r>
-        <w:t>镜头回到最初的书桌，一支铅笔缓缓滑向桌边，被伸来的手接住。小人仍在桌前，窗外留有明暗交接的远景。原结语在中央留白处出现后停住，保留最后的安静。</w:t>
+        <w:t>镜头回到最初的书桌，接住铅笔的动作随入幕自动开始：一支铅笔缓缓滑向桌边，被伸来的手接住。小人仍在桌前，窗外留有明暗交接的远景。原结语在中央留白处出现后停住，保留最后的安静。</w:t>
       </w:r>
     </w:p>
     <w:p>

</xml_diff>

<commit_message>
Keep Repin fullscreen and expand teacher-paced reading passages
Give the painting the full stage and prevent focus from shifting the camera. Add nine reading pages for Anne and the two window stories, distinguish short translated quotations from sourced summaries, and hold each passage until the teacher advances.

Preserve all 40 scenes and existing novel excerpts. Update the teacher script to a 42:30 reading schedule, rebuild Chinese font subsets, and verify reading, closing, and reverse navigation with 24 regression checks.
</commit_message>
<xml_diff>
--- a/teacher_script.docx
+++ b/teacher_script.docx
@@ -25,15 +25,15 @@
         <w:snapToGrid w:val="0"/>
       </w:pPr>
       <w:r>
-        <w:t>六年级  40分钟  课堂问答  阅读游戏  一次小组探究</w:t>
-      </w:r>
-    </w:p>
-    <w:p>
-      <w:pPr>
-        <w:snapToGrid w:val="0"/>
-      </w:pPr>
-      <w:r>
-        <w:t>本稿与网页课件的40个场景一一对应。教师沿着镜头讲述、停住、回读与推进；学生仍按原课程完成初判、证据阅读、三关阅读卡修复、小组主张和退出卡。开场与结语的视觉内容嵌入教师讲解，不增加课堂活动。文字进入阅读区域后，镜头与点缀保持安静。</w:t>
+        <w:t>六年级  完整阅读版约42分30秒  课堂问答  阅读游戏  一次小组探究</w:t>
+      </w:r>
+    </w:p>
+    <w:p>
+      <w:pPr>
+        <w:snapToGrid w:val="0"/>
+      </w:pPr>
+      <w:r>
+        <w:t>本稿与网页40幕对应，保留初判、证据阅读、三关修复、小组主张和退出卡。安妮新增五页阅读，两份现实报道各两页；教师待学生读完再推进。开场与结语嵌入讲述，阅读时镜头与点缀保持安静。</w:t>
       </w:r>
     </w:p>
     <w:p>
@@ -58,7 +58,8 @@
         <w:t xml:space="preserve">时间底线  </w:t>
       </w:r>
       <w:r>
-        <w:t>完整保留两分钟并读、五分钟小组探究与九十秒退出卡。朗读按每分钟约200—240个汉字准备；短场景里的旁白与动作同时发生。动画走完即停住，教师决定何时继续。</w:t>
+        <w:rPr/>
+        <w:t>安妮四幕共4分钟，两份报道各90秒，全课较原版增加2分30秒。两分钟并读、五分钟探究和九十秒退出卡完整保留。先静读，再短连接，不逐句读屏；计时仅作提醒，可暂停，动画结束后停住。</w:t>
       </w:r>
     </w:p>
     <w:p>
@@ -72,7 +73,8 @@
         <w:t xml:space="preserve">资料身份  </w:t>
       </w:r>
       <w:r>
-        <w:t>学生画面省去材料编号、出处和编辑删节标记。教师页保留人物身份、译文身份、出处和日期。非连续摘录必须分成独立文字片段，不能拼成一段貌似连续的引文。</w:t>
+        <w:rPr/>
+        <w:t>《童年》原文与原有教学立意保留。新增阅读区分背景或报道整理、短引工作译文；教师资料保留人物、来源与日期。非连续引句分段显示，不与整理文字拼成连续原文。</w:t>
       </w:r>
     </w:p>
     <w:p>
@@ -91,9 +93,9 @@
         <w:tblLook w:firstColumn="1" w:firstRow="1" w:lastColumn="0" w:lastRow="0" w:noHBand="0" w:noVBand="1" w:val="04A0"/>
       </w:tblPr>
       <w:tblGrid>
-        <w:gridCol w:w="1584"/>
+        <w:gridCol w:w="1944"/>
         <w:gridCol w:w="3168"/>
-        <w:gridCol w:w="5184"/>
+        <w:gridCol w:w="4824"/>
       </w:tblGrid>
       <w:tr>
         <w:trPr>
@@ -102,7 +104,7 @@
         </w:trPr>
         <w:tc>
           <w:tcPr>
-            <w:tcW w:type="dxa" w:w="1584"/>
+            <w:tcW w:type="dxa" w:w="1944"/>
             <w:vAlign w:val="center"/>
             <w:tcBorders>
               <w:top w:val="single" w:sz="4" w:color="D9D9D9"/>
@@ -169,7 +171,7 @@
         </w:tc>
         <w:tc>
           <w:tcPr>
-            <w:tcW w:type="dxa" w:w="5184"/>
+            <w:tcW w:type="dxa" w:w="4824"/>
             <w:vAlign w:val="center"/>
             <w:tcBorders>
               <w:top w:val="single" w:sz="4" w:color="D9D9D9"/>
@@ -207,7 +209,7 @@
         </w:trPr>
         <w:tc>
           <w:tcPr>
-            <w:tcW w:type="dxa" w:w="1584"/>
+            <w:tcW w:type="dxa" w:w="1944"/>
             <w:vAlign w:val="center"/>
             <w:tcBorders>
               <w:top w:val="single" w:sz="4" w:color="D9D9D9"/>
@@ -274,7 +276,7 @@
         </w:tc>
         <w:tc>
           <w:tcPr>
-            <w:tcW w:type="dxa" w:w="5184"/>
+            <w:tcW w:type="dxa" w:w="4824"/>
             <w:vAlign w:val="center"/>
             <w:tcBorders>
               <w:top w:val="single" w:sz="4" w:color="D9D9D9"/>
@@ -312,7 +314,7 @@
         </w:trPr>
         <w:tc>
           <w:tcPr>
-            <w:tcW w:type="dxa" w:w="1584"/>
+            <w:tcW w:type="dxa" w:w="1944"/>
             <w:vAlign w:val="center"/>
             <w:tcBorders>
               <w:top w:val="single" w:sz="4" w:color="D9D9D9"/>
@@ -379,7 +381,7 @@
         </w:tc>
         <w:tc>
           <w:tcPr>
-            <w:tcW w:type="dxa" w:w="5184"/>
+            <w:tcW w:type="dxa" w:w="4824"/>
             <w:vAlign w:val="center"/>
             <w:tcBorders>
               <w:top w:val="single" w:sz="4" w:color="D9D9D9"/>
@@ -417,7 +419,7 @@
         </w:trPr>
         <w:tc>
           <w:tcPr>
-            <w:tcW w:type="dxa" w:w="1584"/>
+            <w:tcW w:type="dxa" w:w="1944"/>
             <w:vAlign w:val="center"/>
             <w:tcBorders>
               <w:top w:val="single" w:sz="4" w:color="D9D9D9"/>
@@ -484,7 +486,7 @@
         </w:tc>
         <w:tc>
           <w:tcPr>
-            <w:tcW w:type="dxa" w:w="5184"/>
+            <w:tcW w:type="dxa" w:w="4824"/>
             <w:vAlign w:val="center"/>
             <w:tcBorders>
               <w:top w:val="single" w:sz="4" w:color="D9D9D9"/>
@@ -522,7 +524,7 @@
         </w:trPr>
         <w:tc>
           <w:tcPr>
-            <w:tcW w:type="dxa" w:w="1584"/>
+            <w:tcW w:type="dxa" w:w="1944"/>
             <w:vAlign w:val="center"/>
             <w:tcBorders>
               <w:top w:val="single" w:sz="4" w:color="D9D9D9"/>
@@ -589,7 +591,7 @@
         </w:tc>
         <w:tc>
           <w:tcPr>
-            <w:tcW w:type="dxa" w:w="5184"/>
+            <w:tcW w:type="dxa" w:w="4824"/>
             <w:vAlign w:val="center"/>
             <w:tcBorders>
               <w:top w:val="single" w:sz="4" w:color="D9D9D9"/>
@@ -627,7 +629,7 @@
         </w:trPr>
         <w:tc>
           <w:tcPr>
-            <w:tcW w:type="dxa" w:w="1584"/>
+            <w:tcW w:type="dxa" w:w="1944"/>
             <w:vAlign w:val="center"/>
             <w:tcBorders>
               <w:top w:val="single" w:sz="4" w:color="D9D9D9"/>
@@ -694,7 +696,7 @@
         </w:tc>
         <w:tc>
           <w:tcPr>
-            <w:tcW w:type="dxa" w:w="5184"/>
+            <w:tcW w:type="dxa" w:w="4824"/>
             <w:vAlign w:val="center"/>
             <w:tcBorders>
               <w:top w:val="single" w:sz="4" w:color="D9D9D9"/>
@@ -732,7 +734,7 @@
         </w:trPr>
         <w:tc>
           <w:tcPr>
-            <w:tcW w:type="dxa" w:w="1584"/>
+            <w:tcW w:type="dxa" w:w="1944"/>
             <w:vAlign w:val="center"/>
             <w:tcBorders>
               <w:top w:val="single" w:sz="4" w:color="D9D9D9"/>
@@ -799,7 +801,7 @@
         </w:tc>
         <w:tc>
           <w:tcPr>
-            <w:tcW w:type="dxa" w:w="5184"/>
+            <w:tcW w:type="dxa" w:w="4824"/>
             <w:vAlign w:val="center"/>
             <w:tcBorders>
               <w:top w:val="single" w:sz="4" w:color="D9D9D9"/>
@@ -826,7 +828,7 @@
               <w:rPr>
                 <w:b w:val="0"/>
               </w:rPr>
-              <w:t>安妮的处境  帮助与愿望</w:t>
+              <w:t>安妮五页阅读  帮助与愿望</w:t>
             </w:r>
           </w:p>
         </w:tc>
@@ -837,7 +839,7 @@
         </w:trPr>
         <w:tc>
           <w:tcPr>
-            <w:tcW w:type="dxa" w:w="1584"/>
+            <w:tcW w:type="dxa" w:w="1944"/>
             <w:vAlign w:val="center"/>
             <w:tcBorders>
               <w:top w:val="single" w:sz="4" w:color="D9D9D9"/>
@@ -904,7 +906,7 @@
         </w:tc>
         <w:tc>
           <w:tcPr>
-            <w:tcW w:type="dxa" w:w="5184"/>
+            <w:tcW w:type="dxa" w:w="4824"/>
             <w:vAlign w:val="center"/>
             <w:tcBorders>
               <w:top w:val="single" w:sz="4" w:color="D9D9D9"/>
@@ -942,7 +944,7 @@
         </w:trPr>
         <w:tc>
           <w:tcPr>
-            <w:tcW w:type="dxa" w:w="1584"/>
+            <w:tcW w:type="dxa" w:w="1944"/>
             <w:vAlign w:val="center"/>
             <w:tcBorders>
               <w:top w:val="single" w:sz="4" w:color="D9D9D9"/>
@@ -970,7 +972,7 @@
               <w:rPr>
                 <w:b w:val="0"/>
               </w:rPr>
-              <w:t>35—38分钟</w:t>
+              <w:t>35:00—40:30</w:t>
             </w:r>
           </w:p>
         </w:tc>
@@ -1009,7 +1011,7 @@
         </w:tc>
         <w:tc>
           <w:tcPr>
-            <w:tcW w:type="dxa" w:w="5184"/>
+            <w:tcW w:type="dxa" w:w="4824"/>
             <w:vAlign w:val="center"/>
             <w:tcBorders>
               <w:top w:val="single" w:sz="4" w:color="D9D9D9"/>
@@ -1036,7 +1038,7 @@
               <w:rPr>
                 <w:b w:val="0"/>
               </w:rPr>
-              <w:t>回到原著  修订  现实儿童  联系日常</w:t>
+              <w:t>回到原著  修订  两份报道阅读  联系日常</w:t>
             </w:r>
           </w:p>
         </w:tc>
@@ -1047,7 +1049,7 @@
         </w:trPr>
         <w:tc>
           <w:tcPr>
-            <w:tcW w:type="dxa" w:w="1584"/>
+            <w:tcW w:type="dxa" w:w="1944"/>
             <w:vAlign w:val="center"/>
             <w:tcBorders>
               <w:top w:val="single" w:sz="4" w:color="D9D9D9"/>
@@ -1075,7 +1077,7 @@
               <w:rPr>
                 <w:b w:val="0"/>
               </w:rPr>
-              <w:t>38—40分钟</w:t>
+              <w:t>40:30—42:30</w:t>
             </w:r>
           </w:p>
         </w:tc>
@@ -1114,7 +1116,7 @@
         </w:tc>
         <w:tc>
           <w:tcPr>
-            <w:tcW w:type="dxa" w:w="5184"/>
+            <w:tcW w:type="dxa" w:w="4824"/>
             <w:vAlign w:val="center"/>
             <w:tcBorders>
               <w:top w:val="single" w:sz="4" w:color="D9D9D9"/>
@@ -1320,7 +1322,7 @@
               <w:rPr>
                 <w:b w:val="0"/>
               </w:rPr>
-              <w:t>先完成本幕步骤，再进入下一幕</w:t>
+              <w:t>先看下一页或本幕步骤，再换幕</w:t>
             </w:r>
           </w:p>
         </w:tc>
@@ -1392,7 +1394,7 @@
               <w:rPr>
                 <w:b w:val="0"/>
               </w:rPr>
-              <w:t>先退回本幕步骤，再返回上一幕</w:t>
+              <w:t>先退回本幕步骤或阅读页</w:t>
             </w:r>
           </w:p>
         </w:tc>
@@ -1849,7 +1851,7 @@
         <w:snapToGrid w:val="0"/>
       </w:pPr>
       <w:r>
-        <w:t>教师备注和资料供备课使用；若N面板会投到学生屏幕，请课前查看，课堂使用本稿或独立设备。所有下一步入口规则相同：先完成本幕的记录、展开或收回步骤，再进入下一幕；全屏空白左键与右键也相同。按钮、关键词、选中文字及面板保留各自操作；普通窗口空白点击不推进。回访已完成记录幕保留笔迹；上一可逐步撤回本幕步骤，R清本幕象征笔迹并从初始步骤重演，关键词与箭头保留。目录可清空整节状态，不恢复旧版输入内容。同幕步骤不重置计时，资料不按倒计时自动开关，也不识别语音。浏览器不支持页面全屏时会进入专注模式，点击规则相同，可再按F11隐藏浏览器边框。</w:t>
+        <w:t>教师备注和来源供备课使用；若N面板会投到学生屏幕，课堂请使用本稿或独立设备。下一步先进入本幕下一阅读页，末页再执行记录、剪影或资料收回，全部完成后才换幕；全屏空白左键与右键规则相同。按钮、关键词、选中文字及面板保留各自操作，普通窗口空白点击不推进。回访保留已完成笔迹；上一先退回本幕步骤或阅读页，R从本幕第一页重演并清本幕笔迹，关键词与箭头保留。目录可清空整节状态。同幕换页不重置计时，阅读计时仅作可选提醒，可暂停并无限停留；资料不自动开关，也不识别语音。浏览器不支持页面全屏时会进入专注模式，点击规则相同，可再按F11隐藏浏览器边框。</w:t>
       </w:r>
     </w:p>
     <w:p>
@@ -1934,7 +1936,7 @@
         <w:t xml:space="preserve">停留安排  </w:t>
       </w:r>
       <w:r>
-        <w:t>课前准备，不占40分钟。画面可以停留；不提前展示三个问题的结论。</w:t>
+        <w:t>课前准备，不占42分30秒。画面可以停留；不提前展示三个问题的结论。</w:t>
       </w:r>
     </w:p>
     <w:p>
@@ -2682,7 +2684,7 @@
         <w:t xml:space="preserve">画面与操作  </w:t>
       </w:r>
       <w:r>
-        <w:t>进入本幕时，画作从书页中展开，先停在完整原画上。教师可选择肩背或纤绳，让局部缓慢放大并停稳，也可回到全图。讲完“把目光接回他的讲述”，按下一步将画作收回书页；再按下一步进入外祖父的原文。不得改变画中人物动作，也不把某一位纤夫标成外祖父。</w:t>
+        <w:t>进入本幕时，以全屏画面展示原画，保留完整构图。教师可选择肩背或纤绳，让局部缓慢放大并停稳，也可回到全图。讲完“把目光接回他的讲述”，按下一步将画作收回书页；再按下一步进入外祖父的原文。不得改变画中人物动作，也不把某一位纤夫标成外祖父。</w:t>
       </w:r>
     </w:p>
     <w:p>
@@ -3891,7 +3893,7 @@
         <w:snapToGrid w:val="0"/>
       </w:pPr>
       <w:r>
-        <w:t>定位 annecontext    用时 23:00—23:35</w:t>
+        <w:t>定位 annecontext    用时 23:00—24:00</w:t>
       </w:r>
     </w:p>
     <w:p>
@@ -3907,12 +3909,15 @@
       </w:r>
     </w:p>
     <w:p>
-      <w:pPr>
-        <w:keepNext/>
-        <w:snapToGrid w:val="0"/>
-      </w:pPr>
-      <w:r>
-        <w:t>这位少女叫安妮·弗兰克。第二次世界大战期间，纳粹迫害犹太人。为了躲避迫害，她和家人在荷兰阿姆斯特丹藏匿起来。窗外仍有街道和日常生活，可对藏身的人来说，走出去意味着危险。请先记住这个处境，再读她的文字。</w:t>
+      <w:pPr/>
+      <w:r>
+        <w:t>请静读两页，留意藏身生活的限制。</w:t>
+      </w:r>
+    </w:p>
+    <w:p>
+      <w:pPr/>
+      <w:r>
+        <w:t>再看看，帮助怎样来到房间里。</w:t>
       </w:r>
     </w:p>
     <w:p>
@@ -3927,7 +3932,7 @@
         <w:t xml:space="preserve">画面与操作  </w:t>
       </w:r>
       <w:r>
-        <w:t>镜头进入手绘藏身空间，窄窗、书与生活物件退到四周，中央留白呈现背景文字。此幕没有安妮人物动画，教师用讲述交代人物与历史处境；文字落定后保持静止。</w:t>
+        <w:t>镜头进入手绘藏身空间，阅读区先显示“窗外的街道，不能走出去”。给学生静读时间后按下一步，进入“一天，从保持安静开始”；两页落定后均保持静止。读完第二页，教师只说一句连接，再按下一步进入帮助。背景整理与安妮短引文分开呈现，不将背景当作日记原文。</w:t>
       </w:r>
     </w:p>
     <w:p>
@@ -3942,7 +3947,7 @@
         <w:t xml:space="preserve">停留安排  </w:t>
       </w:r>
       <w:r>
-        <w:t>35秒，背景与人物关系一次交代清楚；不增加战争历史问答，不补述遇害结局。</w:t>
+        <w:t>60秒：两页各约25秒独立静读，余下约10秒用于指令、短连接与推进。教师不逐句读屏，不增加历史问答，不补述遇害结局。</w:t>
       </w:r>
     </w:p>
     <w:p>
@@ -3975,7 +3980,7 @@
         <w:snapToGrid w:val="0"/>
       </w:pPr>
       <w:r>
-        <w:t>定位 annehelp    用时 23:35—24:00</w:t>
+        <w:t>定位 annehelp    用时 24:00—24:40</w:t>
       </w:r>
     </w:p>
     <w:p>
@@ -3991,12 +3996,15 @@
       </w:r>
     </w:p>
     <w:p>
-      <w:pPr>
-        <w:keepNext/>
-        <w:snapToGrid w:val="0"/>
-      </w:pPr>
-      <w:r>
-        <w:t>他们并不孤立无援。帮助者把食物、衣物和书报送进来，让生活能够继续。这些人冒着风险关心他们，善意有了具体的重量。可是，送进房间的帮助，还不能让迫害停止。</w:t>
+      <w:pPr/>
+      <w:r>
+        <w:t>请静读，找出帮助者做了什么。</w:t>
+      </w:r>
+    </w:p>
+    <w:p>
+      <w:pPr/>
+      <w:r>
+        <w:t>这些帮助支持了生活，窗外仍有危险。</w:t>
       </w:r>
     </w:p>
     <w:p>
@@ -4011,7 +4019,7 @@
         <w:t xml:space="preserve">画面与操作  </w:t>
       </w:r>
       <w:r>
-        <w:t>手绘食物包裹、衣物与书报依次轻轻落定，旁边保留清楚的文字名称，动作总长不超过6秒。窄窗仍在背景，中央文字说明帮助的价值与仍然缺少的自由，随后画面停住。</w:t>
+        <w:t>显示一页“帮助，怎样来到房间里”，食物、衣物与书报在页边依次落定，动作总长不超过6秒。学生阅读背景整理时，正文与镜头保持静止。读完后教师说一句连接，按下一步进入愿望阅读。</w:t>
       </w:r>
     </w:p>
     <w:p>
@@ -4026,7 +4034,7 @@
         <w:t xml:space="preserve">停留安排  </w:t>
       </w:r>
       <w:r>
-        <w:t>25秒。承认帮助的实际价值，再进入愿望；不把帮助者设成已经解决一切的英雄。</w:t>
+        <w:t>40秒：约30秒独立静读，约10秒用于指令、一句连接和推进。不把帮助者设成已经解决一切的英雄。</w:t>
       </w:r>
     </w:p>
     <w:p>
@@ -4043,7 +4051,7 @@
         <w:snapToGrid w:val="0"/>
       </w:pPr>
       <w:r>
-        <w:t>定位 annewish    用时 24:00—25:50</w:t>
+        <w:t>定位 annewish    用时 24:40—26:10</w:t>
       </w:r>
     </w:p>
     <w:p>
@@ -4059,35 +4067,15 @@
       </w:r>
     </w:p>
     <w:p>
-      <w:pPr>
-        <w:snapToGrid w:val="0"/>
-      </w:pPr>
-      <w:r>
-        <w:t>1943年12月24日，安妮写下这些愿望。请安静读一读，她渴望做哪些普通的事？</w:t>
-      </w:r>
-    </w:p>
-    <w:p>
-      <w:pPr>
-        <w:snapToGrid w:val="0"/>
-      </w:pPr>
-      <w:r>
-        <w:t>请一位同学读给大家听。其他同学圈出其中一项，你平时也可能做的事。</w:t>
-      </w:r>
-    </w:p>
-    <w:p>
-      <w:pPr>
-        <w:snapToGrid w:val="0"/>
-      </w:pPr>
-      <w:r>
-        <w:t>再请两位同学各指出一项。先说文字，不急着判断她是不是幸福。</w:t>
-      </w:r>
-    </w:p>
-    <w:p>
-      <w:pPr>
-        <w:snapToGrid w:val="0"/>
-      </w:pPr>
-      <w:r>
-        <w:t>我们刚刚看见的那些活动，现在只映在玻璃上。对安妮来说，它们还没有成为能够走进去的生活。请把这些普通愿望，和我们刚才知道的处境放在一起。</w:t>
+      <w:pPr/>
+      <w:r>
+        <w:t>请静读两页，圈出一个普通愿望。</w:t>
+      </w:r>
+    </w:p>
+    <w:p>
+      <w:pPr/>
+      <w:r>
+        <w:t>窗外的日常，仍是她难以实现的愿望。</w:t>
       </w:r>
     </w:p>
     <w:p>
@@ -4102,7 +4090,7 @@
         <w:t xml:space="preserve">画面与操作  </w:t>
       </w:r>
       <w:r>
-        <w:t>日记文字先在中央纸面稳定显示，教师可按学生指认突出愿望。静读、朗读与两次指认完成后，按下一步展开骑车、跳舞、吹口哨的轻淡剪影，随后讲“我们刚刚看见的那些活动，现在只映在玻璃上”。剪影短暂运动后停住；这些是愿望，安妮仍在室内。讲述结束再按下一步，进入限制处境的追问。</w:t>
+        <w:t>先显示“安静，并不总是安宁”，静读后按下一步，进入1943年12月24日的愿望短引。学生读完并指认一项愿望后，教师可点亮对应词语；再按下一步才展开骑车、跳舞、吹口哨的玻璃剪影。随后说连接句，剪影短暂运动后停住，安妮仍在室内。再按下一步进入限制处境的追问。</w:t>
       </w:r>
     </w:p>
     <w:p>
@@ -4117,7 +4105,7 @@
         <w:t xml:space="preserve">停留安排  </w:t>
       </w:r>
       <w:r>
-        <w:t>110秒：静读约20秒，一人朗读约15秒，两人各用约12秒指认，教师讲述及停顿合计约50秒。</w:t>
+        <w:t>90秒：第一页约40秒、第二页约30秒静读与圈画，一人约8秒指认愿望，其余约12秒用于短指令、剪影回应与连接。不逐句读屏。</w:t>
       </w:r>
     </w:p>
     <w:p>
@@ -4158,7 +4146,7 @@
         <w:snapToGrid w:val="0"/>
       </w:pPr>
       <w:r>
-        <w:t>定位 annetwist    用时 25:50—27:00</w:t>
+        <w:t>定位 annetwist    用时 26:10—27:00</w:t>
       </w:r>
     </w:p>
     <w:p>
@@ -4174,19 +4162,15 @@
       </w:r>
     </w:p>
     <w:p>
-      <w:pPr>
-        <w:snapToGrid w:val="0"/>
-      </w:pPr>
-      <w:r>
-        <w:t>有人爱她，也有人帮助她，为什么她连骑车、吹口哨，都只能写成愿望？</w:t>
-      </w:r>
-    </w:p>
-    <w:p>
-      <w:pPr>
-        <w:snapToGrid w:val="0"/>
-      </w:pPr>
-      <w:r>
-        <w:t>现在，把小茨冈的保护与安妮的愿望放在一起。幸福的童年，最不能缺少什么？请小组先说孩子已经得到什么，再说仍缺什么，用《童年》和安妮材料各一处证据，形成一项主张。选一项优先论证，不表示别的需要就可以取消。两人分别查两份证据，一人质疑，一人记录并发言，五分钟后交流。</w:t>
+      <w:pPr/>
+      <w:r>
+        <w:t>有人爱她、帮助她，为什么这些普通愿望仍难以实现？</w:t>
+      </w:r>
+    </w:p>
+    <w:p>
+      <w:pPr/>
+      <w:r>
+        <w:t>请小组提出一项最不能缺少的条件：先说孩子得到什么、仍缺什么，再用《童年》和安妮材料各一处证据支持。选一项论证，不表示取消其他需要。两人查证据，一人质疑，一人记录发言，五分钟后交流。</w:t>
       </w:r>
     </w:p>
     <w:p>
@@ -4216,7 +4200,7 @@
         <w:t xml:space="preserve">停留安排  </w:t>
       </w:r>
       <w:r>
-        <w:t>70秒：第一问后静候5—8秒；其余用于任务说明、看清分工和前后相邻座位转向，不在此处先展开讨论。</w:t>
+        <w:t>50秒：第一问后静候约5秒，其余用于任务、分工与相邻座位转向。不在此处提前讨论；27:00进入下一幕后才开始完整五分钟计时。</w:t>
       </w:r>
     </w:p>
     <w:p>
@@ -4710,7 +4694,7 @@
         <w:snapToGrid w:val="0"/>
       </w:pPr>
       <w:r>
-        <w:t>定位 yamen    用时 36:35—36:50</w:t>
+        <w:t>定位 yamen    用时 36:35—38:05</w:t>
       </w:r>
     </w:p>
     <w:p>
@@ -4726,12 +4710,15 @@
       </w:r>
     </w:p>
     <w:p>
-      <w:pPr>
-        <w:keepNext/>
-        <w:snapToGrid w:val="0"/>
-      </w:pPr>
-      <w:r>
-        <w:t>2024年9月10日的报道里，亚门的妈妈尽力教他功课。可他还要取水、拾柴，仍需要学校和同伴。</w:t>
+      <w:pPr/>
+      <w:r>
+        <w:t>请静读这份2024年9月10日的报道，留意家庭支持和学校的作用。</w:t>
+      </w:r>
+    </w:p>
+    <w:p>
+      <w:pPr/>
+      <w:r>
+        <w:t>妈妈的帮助真实存在，孩子仍需要学校与同伴。</w:t>
       </w:r>
     </w:p>
     <w:p>
@@ -4746,7 +4733,7 @@
         <w:t xml:space="preserve">画面与操作  </w:t>
       </w:r>
       <w:r>
-        <w:t>进入本幕时，亚门的照片与报道从记忆中展开，在居中阅读空间落定并停止移动。图像保持纪实原貌，不叠加虚构年龄或人物对白。讲完本句后按下一步，将资料收回透明泡泡；再按下一步才进入并展开瓦尔瓦拉资料。</w:t>
+        <w:t>进入本幕时展开亚门照片与第一页“他想回到学校”，落定后静读。按下一步进入“有人教他，学校仍然重要”；采访短引与报道整理分别显示。读完第二页，教师说一句连接，再按下一步将资料收回泡泡；再按才进入瓦尔瓦拉。照片保持纪实原貌，图中成人是父亲，不补写年龄或虚构对白。</w:t>
       </w:r>
     </w:p>
     <w:p>
@@ -4761,7 +4748,7 @@
         <w:t xml:space="preserve">停留安排  </w:t>
       </w:r>
       <w:r>
-        <w:t>15秒。只讲一个明确区别：家人的支持确实存在，学校与同伴仍然重要。屏幕不增加资料问答。</w:t>
+        <w:t>90秒：两页各约35秒独立静读，余下20秒用于简短指令、一句连接与收回。教师不逐句读屏，不增加资料问答。</w:t>
       </w:r>
     </w:p>
     <w:p>
@@ -4794,7 +4781,7 @@
         <w:snapToGrid w:val="0"/>
       </w:pPr>
       <w:r>
-        <w:t>定位 varvara    用时 36:50—37:05</w:t>
+        <w:t>定位 varvara    用时 38:05—39:35</w:t>
       </w:r>
     </w:p>
     <w:p>
@@ -4810,12 +4797,15 @@
       </w:r>
     </w:p>
     <w:p>
-      <w:pPr>
-        <w:keepNext/>
-        <w:snapToGrid w:val="0"/>
-      </w:pPr>
-      <w:r>
-        <w:t>2022年12月19日的报道里，七岁的瓦尔瓦拉在烛光下读书。停电、寒冷，让安稳睡觉也变得困难。</w:t>
+      <w:pPr/>
+      <w:r>
+        <w:t>请静读这份2022年12月19日的报道，瓦尔瓦拉当时七岁。</w:t>
+      </w:r>
+    </w:p>
+    <w:p>
+      <w:pPr/>
+      <w:r>
+        <w:t>母亲点亮蜡烛，孩子仍需要温暖、安全和安稳的夜晚。</w:t>
       </w:r>
     </w:p>
     <w:p>
@@ -4830,7 +4820,7 @@
         <w:t xml:space="preserve">画面与操作  </w:t>
       </w:r>
       <w:r>
-        <w:t>进入本幕时，瓦尔瓦拉的报道与母女照片展开，落定后保持静止。照片本身不是烛光场景；烛光阅读、停电与寒冷来自报道文字，教师结合正文讲述。讲完本句后按下一步，将资料收回透明泡泡；再按下一步回到安静房间，准备处境汇聚。</w:t>
+        <w:t>进入本幕时展开母女照片与第一页“妈妈点亮了蜡烛”，落定后静读。按下一步进入“她还需要一个安稳的夜晚”；采访短引与报道整理分别显示。照片本身不是烛光阅读现场。读完第二页，教师说一句连接，再按下一步将资料收回泡泡；再按才回到安静房间，准备记忆汇聚。</w:t>
       </w:r>
     </w:p>
     <w:p>
@@ -4845,7 +4835,7 @@
         <w:t xml:space="preserve">停留安排  </w:t>
       </w:r>
       <w:r>
-        <w:t>15秒。“七岁”指报道当时的年龄；不当作她现在的年龄，也不虚构她说过的话。</w:t>
+        <w:t>90秒：两页各约35秒独立静读，余下20秒用于简短指令、一句连接与收回。“七岁”是报道时的年龄，不当作现在的年龄。</w:t>
       </w:r>
     </w:p>
     <w:p>
@@ -4878,7 +4868,7 @@
         <w:snapToGrid w:val="0"/>
       </w:pPr>
       <w:r>
-        <w:t>定位 pressure    用时 37:05—37:30</w:t>
+        <w:t>定位 pressure    用时 39:35—40:00</w:t>
       </w:r>
     </w:p>
     <w:p>
@@ -4962,7 +4952,7 @@
         <w:snapToGrid w:val="0"/>
       </w:pPr>
       <w:r>
-        <w:t>定位 daily    用时 37:30—38:00</w:t>
+        <w:t>定位 daily    用时 40:00—40:30</w:t>
       </w:r>
     </w:p>
     <w:p>
@@ -4998,7 +4988,7 @@
         <w:t xml:space="preserve">画面与操作  </w:t>
       </w:r>
       <w:r>
-        <w:t>镜头平稳回到书桌，纸面中央呈现两个日常例子与联系生活的提问，周围点缀停住。退出卡三个句式在下一幕才出现；教师可以在本幕先口述写作指令，并在38:00前讲完。</w:t>
+        <w:t>镜头平稳回到书桌，纸面中央呈现两个日常例子与联系生活的提问，周围点缀停住。退出卡三个句式在下一幕才出现；教师可以在本幕先口述写作指令，并在40:30前讲完。</w:t>
       </w:r>
     </w:p>
     <w:p>
@@ -5054,7 +5044,7 @@
         <w:snapToGrid w:val="0"/>
       </w:pPr>
       <w:r>
-        <w:t>定位 exit    用时 38:00—39:30</w:t>
+        <w:t>定位 exit    用时 40:30—42:00</w:t>
       </w:r>
     </w:p>
     <w:p>
@@ -5099,7 +5089,7 @@
         <w:t xml:space="preserve">停留安排  </w:t>
       </w:r>
       <w:r>
-        <w:t>38:00—39:30完整90秒独立书写。教师保持安静，不补讲、不要求临时展示。学生写完可自行检查：判断、原著证据、日常体现是否都有。</w:t>
+        <w:t>40:30—42:00完整90秒独立书写。教师保持安静，不补讲、不要求临时展示。学生写完可自行检查：判断、原著证据、日常体现是否都有。</w:t>
       </w:r>
     </w:p>
     <w:p>
@@ -5117,7 +5107,7 @@
         <w:snapToGrid w:val="0"/>
       </w:pPr>
       <w:r>
-        <w:t>定位 support    用时 39:30—39:38</w:t>
+        <w:t>定位 support    用时 42:00—42:08</w:t>
       </w:r>
     </w:p>
     <w:p>
@@ -5186,7 +5176,7 @@
         <w:snapToGrid w:val="0"/>
       </w:pPr>
       <w:r>
-        <w:t>定位 ending    用时 39:38—39:52</w:t>
+        <w:t>定位 ending    用时 42:08—42:22</w:t>
       </w:r>
     </w:p>
     <w:p>
@@ -5255,7 +5245,7 @@
         <w:snapToGrid w:val="0"/>
       </w:pPr>
       <w:r>
-        <w:t>定位 homework    用时 39:52—40:00</w:t>
+        <w:t>定位 homework    用时 42:22—42:30</w:t>
       </w:r>
     </w:p>
     <w:p>
@@ -5859,20 +5849,42 @@
         <w:pStyle w:val="Heading2"/>
       </w:pPr>
       <w:r>
-        <w:t>安妮的处境与日记短句</w:t>
-      </w:r>
-    </w:p>
-    <w:p>
-      <w:pPr>
-        <w:snapToGrid w:val="0"/>
-      </w:pPr>
-      <w:r>
-        <w:t>第二次世界大战期间，犹太女孩安妮·弗兰克为躲避纳粹迫害在荷兰阿姆斯特丹藏匿。1942—1944年，八名藏匿者依靠六位帮助者得到食物、衣物、书籍、杂志和报纸。这些帮助支持了生活，迫害仍使自由出行危险。不要加入原教案未使用的遇害结局。</w:t>
-      </w:r>
-    </w:p>
-    <w:p>
-      <w:pPr>
-        <w:snapToGrid w:val="0"/>
+        <w:t>扩展阅读文字与资料身份</w:t>
+      </w:r>
+    </w:p>
+    <w:p>
+      <w:pPr/>
+      <w:r>
+        <w:t>以下逐页列出网页新增阅读文字。无引号的背景与报道整理帮助学生理解处境；标明说话者的短引为课堂工作译文，不冒充某一中文出版译本或报道全文。各页保持原有段落边界，阅读提示由教师编写。</w:t>
+      </w:r>
+    </w:p>
+    <w:p>
+      <w:pPr/>
+      <w:r>
+        <w:t>与《童年》并读，比较的是孩子得到的支持和仍然需要的生活条件。家庭暴力与纳粹迫害的成因不同；现实报道也不能被说成今天的即时近况。</w:t>
+      </w:r>
+    </w:p>
+    <w:p>
+      <w:pPr>
+        <w:pStyle w:val="Heading2"/>
+        <w:keepNext/>
+      </w:pPr>
+      <w:r>
+        <w:t>安妮藏身生活</w:t>
+      </w:r>
+    </w:p>
+    <w:p>
+      <w:pPr>
+        <w:pStyle w:val="Heading3"/>
+        <w:keepNext/>
+      </w:pPr>
+      <w:r>
+        <w:t>第1页 窗外的街道不能走出去</w:t>
+      </w:r>
+    </w:p>
+    <w:p>
+      <w:pPr>
+        <w:keepNext/>
       </w:pPr>
       <w:r>
         <w:rPr>
@@ -5881,159 +5893,973 @@
         <w:t xml:space="preserve">文字身份  </w:t>
       </w:r>
       <w:r>
-        <w:t>日记日期  1943年12月24日。文字据安妮之家教学资料所引英文自译，属于课堂工作译文，不冒充某一中文出版译本。屏幕所示为截取片段，不代表整篇日记或完整原句；末尾句号只用于阅读显示。</w:t>
-      </w:r>
-    </w:p>
-    <w:p>
-      <w:pPr>
-        <w:snapToGrid w:val="0"/>
-      </w:pPr>
-      <w:r>
-        <w:t>我渴望骑车、跳舞、吹口哨，看看世界，感受青春，知道自己是自由的。</w:t>
-      </w:r>
-    </w:p>
-    <w:p>
+        <w:t>背景阅读</w:t>
+      </w:r>
+    </w:p>
+    <w:p>
+      <w:pPr/>
+      <w:r>
+        <w:t>第二次世界大战期间，犹太女孩安妮·弗兰克为了躲避纳粹迫害，和家人在荷兰阿姆斯特丹藏匿。1942年至1944年，包括安妮一家在内的八个人，依靠帮助者维持藏身生活。</w:t>
+      </w:r>
+    </w:p>
+    <w:p>
+      <w:pPr>
+        <w:keepNext/>
+      </w:pPr>
+      <w:r>
+        <w:t>食物、衣物和书报需要从外面送进来。窗外仍有街道和人们的日常生活，但躲藏的人不能像从前那样出门。屋内有人陪伴，并不意味着屋外已经安全。</w:t>
+      </w:r>
+    </w:p>
+    <w:p>
+      <w:pPr>
+        <w:keepLines/>
+      </w:pPr>
+      <w:r>
+        <w:rPr>
+          <w:b/>
+          <w:sz w:val="20"/>
+        </w:rPr>
+        <w:t xml:space="preserve">本页来源  </w:t>
+      </w:r>
+      <w:r>
+        <w:rPr>
+          <w:sz w:val="20"/>
+        </w:rPr>
+        <w:t>The main characters</w:t>
+      </w:r>
+    </w:p>
+    <w:p>
+      <w:pPr>
+        <w:pStyle w:val="Heading3"/>
+        <w:keepNext/>
+      </w:pPr>
+      <w:r>
+        <w:t>第2页 一天从保持安静开始</w:t>
+      </w:r>
+    </w:p>
+    <w:p>
+      <w:pPr>
+        <w:keepNext/>
+      </w:pPr>
+      <w:r>
+        <w:rPr>
+          <w:b/>
+        </w:rPr>
+        <w:t xml:space="preserve">文字身份  </w:t>
+      </w:r>
+      <w:r>
+        <w:t>背景阅读 · 安妮的短引文</w:t>
+      </w:r>
+    </w:p>
+    <w:p>
+      <w:pPr/>
+      <w:r>
+        <w:t>上午八点半，楼下仓库的工人开始工作，知情的办公室帮助者还没有到。躲藏的人必须格外小心，因为楼下的人不知道他们就在头顶。</w:t>
+      </w:r>
+    </w:p>
+    <w:p>
+      <w:pPr/>
+      <w:r>
+        <w:t>安妮写下的话（短引工作译文）：“一滴水也不能放，不能上厕所，不能走动，一切都要安静。”</w:t>
+      </w:r>
+    </w:p>
+    <w:p>
+      <w:pPr>
+        <w:keepNext/>
+      </w:pPr>
+      <w:r>
+        <w:t>九点以后，帮助者来到办公室，藏匿者仍要轻声活动。阅读和学习占据了上午的许多时间。等到天黑，窗户还必须遮严，屋里再次安静下来。</w:t>
+      </w:r>
+    </w:p>
+    <w:p>
+      <w:pPr>
+        <w:keepLines/>
+      </w:pPr>
+      <w:r>
+        <w:rPr>
+          <w:b/>
+          <w:sz w:val="20"/>
+        </w:rPr>
+        <w:t xml:space="preserve">本页来源  </w:t>
+      </w:r>
+      <w:r>
+        <w:rPr>
+          <w:sz w:val="20"/>
+        </w:rPr>
+        <w:t>A typical day in the Secret Annex；The Secret Annex — When the people in hiding had to be quiet, Otto Frank read Dickens</w:t>
+      </w:r>
+    </w:p>
+    <w:p>
+      <w:pPr>
+        <w:pStyle w:val="Heading2"/>
+        <w:keepNext/>
+      </w:pPr>
+      <w:r>
+        <w:t>送进来的帮助</w:t>
+      </w:r>
+    </w:p>
+    <w:p>
+      <w:pPr>
+        <w:pStyle w:val="Heading3"/>
+        <w:keepNext/>
+      </w:pPr>
+      <w:r>
+        <w:t>第1页 帮助怎样来到房间里</w:t>
+      </w:r>
+    </w:p>
+    <w:p>
+      <w:pPr>
+        <w:keepNext/>
+      </w:pPr>
+      <w:r>
+        <w:rPr>
+          <w:b/>
+        </w:rPr>
+        <w:t xml:space="preserve">文字身份  </w:t>
+      </w:r>
+      <w:r>
+        <w:t>背景阅读</w:t>
+      </w:r>
+    </w:p>
+    <w:p>
+      <w:pPr/>
+      <w:r>
+        <w:t>六位帮助者把藏身处和外面的世界联系起来。他们送来食物、衣物、书籍、杂志和报纸。每一种物品，都对应着房间里真实的生活需要。</w:t>
+      </w:r>
+    </w:p>
+    <w:p>
+      <w:pPr>
+        <w:keepNext/>
+      </w:pPr>
+      <w:r>
+        <w:t>午间，楼下的工人离开后，一些帮助者会来到藏身处，和大家一起吃午饭，带来城里的消息。帮助不只是一句安慰，也体现在反复奔走、送来物品和相聚的时间里。</w:t>
+      </w:r>
+    </w:p>
+    <w:p>
+      <w:pPr>
+        <w:keepLines/>
+      </w:pPr>
+      <w:r>
+        <w:rPr>
+          <w:b/>
+          <w:sz w:val="20"/>
+        </w:rPr>
+        <w:t xml:space="preserve">本页来源  </w:t>
+      </w:r>
+      <w:r>
+        <w:rPr>
+          <w:sz w:val="20"/>
+        </w:rPr>
+        <w:t>The main characters；A typical day in the Secret Annex</w:t>
+      </w:r>
+    </w:p>
+    <w:p>
+      <w:pPr>
+        <w:pStyle w:val="Heading2"/>
+        <w:keepNext/>
+      </w:pPr>
+      <w:r>
+        <w:t>安妮的安静与愿望</w:t>
+      </w:r>
+    </w:p>
+    <w:p>
+      <w:pPr>
+        <w:pStyle w:val="Heading3"/>
+        <w:keepNext/>
+      </w:pPr>
+      <w:r>
+        <w:t>第1页 安静并不总是安宁</w:t>
+      </w:r>
+    </w:p>
+    <w:p>
+      <w:pPr>
+        <w:keepNext/>
+      </w:pPr>
+      <w:r>
+        <w:rPr>
+          <w:b/>
+        </w:rPr>
+        <w:t xml:space="preserve">文字身份  </w:t>
+      </w:r>
+      <w:r>
+        <w:t>背景阅读 · 安妮的短引文</w:t>
+      </w:r>
+    </w:p>
+    <w:p>
+      <w:pPr/>
+      <w:r>
+        <w:t>藏身处的星期日有另一种节奏：清扫、洗衣、整理床铺，听广播，再休息。安妮却觉得星期日尤其难熬。活动仍被限制在楼里，漫长的安静不能让她忘记外面的生活。</w:t>
+      </w:r>
+    </w:p>
+    <w:p>
+      <w:pPr/>
+      <w:r>
+        <w:t>安妮心里的呼喊（短引工作译文）：“外面，新鲜的空气和笑声！”</w:t>
+      </w:r>
+    </w:p>
+    <w:p>
+      <w:pPr>
+        <w:keepNext/>
+      </w:pPr>
+      <w:r>
+        <w:t>把这样的日常放在心里，再读她写下的愿望。留意那些平常的动作：它们要在怎样的生活里，才会成为随时可以做的事？</w:t>
+      </w:r>
+    </w:p>
+    <w:p>
+      <w:pPr>
+        <w:keepLines/>
+      </w:pPr>
+      <w:r>
+        <w:rPr>
+          <w:b/>
+          <w:sz w:val="20"/>
+        </w:rPr>
+        <w:t xml:space="preserve">本页来源  </w:t>
+      </w:r>
+      <w:r>
+        <w:rPr>
+          <w:sz w:val="20"/>
+        </w:rPr>
+        <w:t>A typical day in the Secret Annex</w:t>
+      </w:r>
+    </w:p>
+    <w:p>
+      <w:pPr>
+        <w:pStyle w:val="Heading3"/>
+        <w:keepNext/>
+      </w:pPr>
+      <w:r>
+        <w:t>第2页 她渴望的是怎样的生活</w:t>
+      </w:r>
+    </w:p>
+    <w:p>
+      <w:pPr>
+        <w:keepNext/>
+      </w:pPr>
+      <w:r>
+        <w:rPr>
+          <w:b/>
+        </w:rPr>
+        <w:t xml:space="preserve">文字身份  </w:t>
+      </w:r>
+      <w:r>
+        <w:t>日记短引</w:t>
+      </w:r>
+    </w:p>
+    <w:p>
+      <w:pPr/>
+      <w:r>
+        <w:t>安妮（短引工作译文）：“我渴望骑车、跳舞、吹口哨，看看世界，感受青春，知道自己是自由的。”</w:t>
+      </w:r>
+    </w:p>
+    <w:p>
+      <w:pPr>
+        <w:keepNext/>
+      </w:pPr>
+      <w:r>
+        <w:rPr>
+          <w:b/>
+        </w:rPr>
+        <w:t xml:space="preserve">阅读提示  </w:t>
+      </w:r>
+      <w:r>
+        <w:t>读出一种普通的愿望，也读出它需要的条件。</w:t>
+      </w:r>
+    </w:p>
+    <w:p>
+      <w:pPr>
+        <w:keepLines/>
+      </w:pPr>
+      <w:r>
+        <w:rPr>
+          <w:b/>
+          <w:sz w:val="20"/>
+        </w:rPr>
+        <w:t xml:space="preserve">本页来源  </w:t>
+      </w:r>
+      <w:r>
+        <w:rPr>
+          <w:sz w:val="20"/>
+        </w:rPr>
+        <w:t>EXTRA Freedom</w:t>
+      </w:r>
+    </w:p>
+    <w:p>
+      <w:pPr>
+        <w:pStyle w:val="Heading2"/>
+        <w:keepNext/>
+      </w:pPr>
+      <w:r>
+        <w:t>亚门的学校与同伴</w:t>
+      </w:r>
+    </w:p>
+    <w:p>
+      <w:pPr>
+        <w:pStyle w:val="Heading3"/>
+        <w:keepNext/>
+      </w:pPr>
+      <w:r>
+        <w:t>第1页 他想回到学校</w:t>
+      </w:r>
+    </w:p>
+    <w:p>
+      <w:pPr>
+        <w:keepNext/>
+      </w:pPr>
+      <w:r>
+        <w:rPr>
+          <w:b/>
+        </w:rPr>
+        <w:t xml:space="preserve">文字身份  </w:t>
+      </w:r>
+      <w:r>
+        <w:t>报道阅读 · 短引文与内容整理</w:t>
+      </w:r>
+    </w:p>
+    <w:p>
+      <w:pPr/>
+      <w:r>
+        <w:t>在联合国儿童基金会这篇关于加沙的报道中，亚门仍在学习。他的母亲是一名教师，在家里教他功课。学习之外，他还要取水，收集做饭用的木柴。</w:t>
+      </w:r>
+    </w:p>
+    <w:p>
+      <w:pPr/>
+      <w:r>
+        <w:t>亚门（短引工作译文）：“我想念上学的日子，很想重新接受教育。”</w:t>
+      </w:r>
+    </w:p>
+    <w:p>
+      <w:pPr>
+        <w:keepNext/>
+      </w:pPr>
+      <w:r>
+        <w:t>亚门（短引工作译文）：“妈妈是一名教师，她在家里教我。”</w:t>
+      </w:r>
+    </w:p>
+    <w:p>
+      <w:pPr>
+        <w:keepLines/>
+      </w:pPr>
+      <w:r>
+        <w:rPr>
+          <w:b/>
+          <w:sz w:val="20"/>
+        </w:rPr>
+        <w:t xml:space="preserve">本页来源  </w:t>
+      </w:r>
+      <w:r>
+        <w:rPr>
+          <w:sz w:val="20"/>
+        </w:rPr>
+        <w:t>Hope amid the rubble – Restoring learning in the Gaza Strip</w:t>
+      </w:r>
+    </w:p>
+    <w:p>
+      <w:pPr>
+        <w:pStyle w:val="Heading3"/>
+        <w:keepNext/>
+      </w:pPr>
+      <w:r>
+        <w:t>第2页 有人教他学校仍然重要</w:t>
+      </w:r>
+    </w:p>
+    <w:p>
+      <w:pPr>
+        <w:keepNext/>
+      </w:pPr>
+      <w:r>
+        <w:rPr>
+          <w:b/>
+        </w:rPr>
+        <w:t xml:space="preserve">文字身份  </w:t>
+      </w:r>
+      <w:r>
+        <w:t>报道内容整理</w:t>
+      </w:r>
+    </w:p>
+    <w:p>
+      <w:pPr/>
+      <w:r>
+        <w:t>父亲肯定母亲为弥补孩子失学所作的努力，也指出家庭教学的局限：在合适的教室里与同伴一起学习，仍然无法被完全替代。</w:t>
+      </w:r>
+    </w:p>
+    <w:p>
+      <w:pPr/>
+      <w:r>
+        <w:t>报道还写到，一些没有被毁坏的学校被用作避难处。许多孩子的生活被取水、搬运和照顾弟妹占据；重新找到学习的地方，又可能因新的撤离而中断。</w:t>
+      </w:r>
+    </w:p>
+    <w:p>
+      <w:pPr>
+        <w:keepNext/>
+      </w:pPr>
+      <w:r>
+        <w:t>家庭和社区正在尝试恢复学习。对这些孩子来说，需要回来的不仅是课本，还有能够安稳学习、与同伴相处的日常。</w:t>
+      </w:r>
+    </w:p>
+    <w:p>
+      <w:pPr>
+        <w:keepLines/>
+      </w:pPr>
+      <w:r>
+        <w:rPr>
+          <w:b/>
+          <w:sz w:val="20"/>
+        </w:rPr>
+        <w:t xml:space="preserve">本页来源  </w:t>
+      </w:r>
+      <w:r>
+        <w:rPr>
+          <w:sz w:val="20"/>
+        </w:rPr>
+        <w:t>Hope amid the rubble – Restoring learning in the Gaza Strip</w:t>
+      </w:r>
+    </w:p>
+    <w:p>
+      <w:pPr>
+        <w:pStyle w:val="Heading2"/>
+        <w:keepNext/>
+      </w:pPr>
+      <w:r>
+        <w:t>瓦尔瓦拉的灯光与温暖</w:t>
+      </w:r>
+    </w:p>
+    <w:p>
+      <w:pPr>
+        <w:pStyle w:val="Heading3"/>
+        <w:keepNext/>
+      </w:pPr>
+      <w:r>
+        <w:t>第1页 妈妈点亮了蜡烛</w:t>
+      </w:r>
+    </w:p>
+    <w:p>
+      <w:pPr>
+        <w:keepNext/>
+      </w:pPr>
+      <w:r>
+        <w:rPr>
+          <w:b/>
+        </w:rPr>
+        <w:t xml:space="preserve">文字身份  </w:t>
+      </w:r>
+      <w:r>
+        <w:t>报道内容整理</w:t>
+      </w:r>
+    </w:p>
+    <w:p>
+      <w:pPr/>
+      <w:r>
+        <w:t>报道中的瓦尔瓦拉当时七岁，住在乌克兰布恰。停电时，母亲点起蜡烛，让她和哥哥继续读书、写作业。</w:t>
+      </w:r>
+    </w:p>
+    <w:p>
+      <w:pPr/>
+      <w:r>
+        <w:t>她喜欢的童话里，有一只害怕春天到来的狐狸。她自己却盼着冬天赶快结束：家中供暖依赖电力，战争造成的停电让房间既暗又冷。</w:t>
+      </w:r>
+    </w:p>
+    <w:p>
+      <w:pPr>
+        <w:keepNext/>
+      </w:pPr>
+      <w:r>
+        <w:t>哥哥在烛光下学习英语。母亲仍设法照顾他们，可是几支蜡烛能照亮作业本，不能恢复整栋楼的供暖。</w:t>
+      </w:r>
+    </w:p>
+    <w:p>
+      <w:pPr>
+        <w:keepLines/>
+      </w:pPr>
+      <w:r>
+        <w:rPr>
+          <w:b/>
+          <w:sz w:val="20"/>
+        </w:rPr>
+        <w:t xml:space="preserve">本页来源  </w:t>
+      </w:r>
+      <w:r>
+        <w:rPr>
+          <w:sz w:val="20"/>
+        </w:rPr>
+        <w:t>As winter bites, needs intensify for families in Ukraine</w:t>
+      </w:r>
+    </w:p>
+    <w:p>
+      <w:pPr>
+        <w:pStyle w:val="Heading3"/>
+        <w:keepNext/>
+      </w:pPr>
+      <w:r>
+        <w:t>第2页 她还需要一个安稳的夜晚</w:t>
+      </w:r>
+    </w:p>
+    <w:p>
+      <w:pPr>
+        <w:keepNext/>
+      </w:pPr>
+      <w:r>
+        <w:rPr>
+          <w:b/>
+        </w:rPr>
+        <w:t xml:space="preserve">文字身份  </w:t>
+      </w:r>
+      <w:r>
+        <w:t>报道阅读 · 短引文与内容整理</w:t>
+      </w:r>
+    </w:p>
+    <w:p>
+      <w:pPr/>
+      <w:r>
+        <w:t>瓦尔瓦拉（短引工作译文）：“没有灯光，我就睡不着。”</w:t>
+      </w:r>
+    </w:p>
+    <w:p>
+      <w:pPr/>
+      <w:r>
+        <w:t>瓦尔瓦拉（短引工作译文）：“有时我害怕走过走廊，因为那里没有灯光。”</w:t>
+      </w:r>
+    </w:p>
+    <w:p>
+      <w:pPr>
+        <w:keepNext/>
+      </w:pPr>
+      <w:r>
+        <w:t>她借助手电筒和蜡烛阅读、写作业，也用它们在家里找路。白天，学校的课程还常被防空警报打断。读书、取暖和睡觉，这些普通的事都受到战争影响。</w:t>
+      </w:r>
+    </w:p>
+    <w:p>
+      <w:pPr>
+        <w:keepLines/>
+      </w:pPr>
+      <w:r>
+        <w:rPr>
+          <w:b/>
+          <w:sz w:val="20"/>
+        </w:rPr>
+        <w:t xml:space="preserve">本页来源  </w:t>
+      </w:r>
+      <w:r>
+        <w:rPr>
+          <w:sz w:val="20"/>
+        </w:rPr>
+        <w:t>As winter bites, needs intensify for families in Ukraine</w:t>
+      </w:r>
+    </w:p>
+    <w:p>
+      <w:pPr>
+        <w:pStyle w:val="Heading2"/>
+      </w:pPr>
+      <w:r>
+        <w:t>原始来源与使用说明</w:t>
+      </w:r>
+    </w:p>
+    <w:p>
+      <w:pPr>
+        <w:pStyle w:val="Heading3"/>
+        <w:keepNext/>
+        <w:keepLines/>
+        <w:spacing w:line="320" w:lineRule="exact" w:after="60" w:before="180"/>
+      </w:pPr>
+      <w:r>
+        <w:rPr>
+          <w:sz w:val="22"/>
+        </w:rPr>
+        <w:t>Anne Frank House  The main characters</w:t>
+      </w:r>
+    </w:p>
+    <w:p>
+      <w:pPr>
+        <w:keepNext/>
+        <w:keepLines/>
+        <w:spacing w:line="320" w:lineRule="exact" w:after="60"/>
+      </w:pPr>
+      <w:r>
+        <w:rPr>
+          <w:b/>
+          <w:sz w:val="22"/>
+        </w:rPr>
+        <w:t xml:space="preserve">文字身份  </w:t>
+      </w:r>
+      <w:r>
+        <w:rPr>
+          <w:sz w:val="22"/>
+        </w:rPr>
+        <w:t>背景整理；不是安妮日记原文。八名藏匿者、六位帮助者及物品种类也见用户提供的完整教案。</w:t>
+      </w:r>
+    </w:p>
+    <w:p>
+      <w:pPr>
+        <w:keepNext w:val="0"/>
+        <w:keepLines/>
+        <w:spacing w:line="320" w:lineRule="exact" w:after="60"/>
+      </w:pPr>
+      <w:r>
+        <w:rPr>
+          <w:sz w:val="22"/>
+        </w:rPr>
+        <w:t xml:space="preserve">原始网页  </w:t>
+      </w:r>
+      <w:hyperlink r:id="rId12">
+        <w:r>
+          <w:rPr>
+            <w:color w:val="23637A"/>
+            <w:u w:val="single"/>
+            <w:sz w:val="20"/>
+          </w:rPr>
+          <w:t>https://www.annefrank.org/en/anne-frank/main-characters/</w:t>
+        </w:r>
+      </w:hyperlink>
+    </w:p>
+    <w:p>
+      <w:pPr>
+        <w:pStyle w:val="Heading3"/>
+        <w:keepNext/>
+        <w:keepLines/>
+        <w:spacing w:line="320" w:lineRule="exact" w:after="60" w:before="180"/>
+      </w:pPr>
+      <w:r>
+        <w:rPr>
+          <w:sz w:val="22"/>
+        </w:rPr>
+        <w:t>Anne Frank House  A typical day in the Secret Annex</w:t>
+      </w:r>
+    </w:p>
+    <w:p>
+      <w:pPr>
+        <w:keepNext/>
+        <w:keepLines/>
+        <w:spacing w:line="320" w:lineRule="exact" w:after="60"/>
+      </w:pPr>
+      <w:r>
+        <w:rPr>
+          <w:b/>
+          <w:sz w:val="22"/>
+        </w:rPr>
+        <w:t xml:space="preserve">文字身份  </w:t>
+      </w:r>
+      <w:r>
+        <w:rPr>
+          <w:sz w:val="22"/>
+        </w:rPr>
+        <w:t>日常作息据馆方说明整理；“外面，新鲜的空气和笑声！”是其中所引安妮文字的短句工作译文。阅读提示为教师编写。</w:t>
+      </w:r>
+    </w:p>
+    <w:p>
+      <w:pPr>
+        <w:keepNext w:val="0"/>
+        <w:keepLines/>
+        <w:spacing w:line="320" w:lineRule="exact" w:after="60"/>
+      </w:pPr>
+      <w:r>
+        <w:rPr>
+          <w:sz w:val="22"/>
+        </w:rPr>
+        <w:t xml:space="preserve">原始网页  </w:t>
+      </w:r>
+      <w:hyperlink r:id="rId15">
+        <w:r>
+          <w:rPr>
+            <w:color w:val="23637A"/>
+            <w:u w:val="single"/>
+            <w:sz w:val="20"/>
+          </w:rPr>
+          <w:t>https://www.annefrank.org/en/anne-frank/go-in-depth/typical-day-secret-annex/</w:t>
+        </w:r>
+      </w:hyperlink>
+    </w:p>
+    <w:p>
+      <w:pPr>
+        <w:pStyle w:val="Heading3"/>
+        <w:keepNext/>
+        <w:keepLines/>
+        <w:spacing w:line="320" w:lineRule="exact" w:after="60" w:before="180"/>
+      </w:pPr>
+      <w:r>
+        <w:rPr>
+          <w:sz w:val="22"/>
+        </w:rPr>
+        <w:t>Anne Frank House  The Secret Annex — When the people in hiding had to be quiet, Otto Frank read Dickens</w:t>
+      </w:r>
+    </w:p>
+    <w:p>
+      <w:pPr>
+        <w:keepNext/>
+        <w:keepLines/>
+        <w:spacing w:line="320" w:lineRule="exact" w:after="60"/>
+      </w:pPr>
+      <w:r>
+        <w:rPr>
+          <w:b/>
+          <w:sz w:val="22"/>
+        </w:rPr>
+        <w:t xml:space="preserve">文字身份  </w:t>
+      </w:r>
+      <w:r>
+        <w:rPr>
+          <w:sz w:val="22"/>
+        </w:rPr>
+        <w:t>安妮短文相关引句的课堂工作译文；馆方注明1943年8月6日短文、1943年8月23日日记收录，不冒充中文出版译本。</w:t>
+      </w:r>
+    </w:p>
+    <w:p>
+      <w:pPr>
+        <w:keepNext w:val="0"/>
+        <w:keepLines/>
+        <w:spacing w:line="320" w:lineRule="exact" w:after="60"/>
+      </w:pPr>
+      <w:r>
+        <w:rPr>
+          <w:sz w:val="22"/>
+        </w:rPr>
+        <w:t xml:space="preserve">原始网页  </w:t>
+      </w:r>
+      <w:hyperlink r:id="rId16">
+        <w:r>
+          <w:rPr>
+            <w:color w:val="23637A"/>
+            <w:u w:val="single"/>
+            <w:sz w:val="20"/>
+          </w:rPr>
+          <w:t>https://www.annefrank.org/en/anne-frank/secret-annex/entrance/</w:t>
+        </w:r>
+      </w:hyperlink>
+    </w:p>
+    <w:p>
+      <w:pPr>
+        <w:pStyle w:val="Heading3"/>
+        <w:keepNext/>
+        <w:keepLines/>
+        <w:spacing w:line="320" w:lineRule="exact" w:after="60" w:before="180"/>
+      </w:pPr>
+      <w:r>
+        <w:rPr>
+          <w:sz w:val="22"/>
+        </w:rPr>
+        <w:t>Anne Frank House  EXTRA Freedom</w:t>
+      </w:r>
+    </w:p>
+    <w:p>
+      <w:pPr>
+        <w:keepNext/>
+        <w:keepLines/>
+        <w:spacing w:line="320" w:lineRule="exact" w:after="60"/>
+      </w:pPr>
+      <w:r>
+        <w:rPr>
+          <w:b/>
+          <w:sz w:val="22"/>
+        </w:rPr>
+        <w:t xml:space="preserve">文字身份  </w:t>
+      </w:r>
+      <w:r>
+        <w:rPr>
+          <w:sz w:val="22"/>
+        </w:rPr>
+        <w:t>1943年12月24日日记短引，沿用用户提供教案的课堂工作译文。</w:t>
+      </w:r>
+    </w:p>
+    <w:p>
+      <w:pPr>
+        <w:keepNext w:val="0"/>
+        <w:keepLines/>
+        <w:spacing w:line="320" w:lineRule="exact" w:after="60"/>
+      </w:pPr>
+      <w:r>
+        <w:rPr>
+          <w:sz w:val="22"/>
+        </w:rPr>
+        <w:t xml:space="preserve">原始网页  </w:t>
+      </w:r>
       <w:hyperlink r:id="rId11">
         <w:r>
           <w:rPr>
-            <w:rFonts w:ascii="Noto Sans CJK SC" w:hAnsi="Noto Sans CJK SC" w:eastAsia="Noto Sans CJK SC"/>
-            <w:color w:val="18536B"/>
-            <w:sz w:val="24"/>
+            <w:color w:val="23637A"/>
             <w:u w:val="single"/>
+            <w:sz w:val="20"/>
           </w:rPr>
-          <w:t>安妮之家 Freedom 教学资料 第1页</w:t>
+          <w:t>https://www.annefrank.org/media/filer_public/d9/b4/d9b451a0-5471-4789-8ead-ea417eebeecb/afvd_werkblad_vo_5_vrijheid-en.pdf</w:t>
         </w:r>
       </w:hyperlink>
     </w:p>
     <w:p>
-      <w:hyperlink r:id="rId12">
-        <w:r>
-          <w:rPr>
-            <w:rFonts w:ascii="Noto Sans CJK SC" w:hAnsi="Noto Sans CJK SC" w:eastAsia="Noto Sans CJK SC"/>
-            <w:color w:val="18536B"/>
-            <w:sz w:val="24"/>
-            <w:u w:val="single"/>
-          </w:rPr>
-          <w:t>安妮之家 藏匿者与帮助者</w:t>
-        </w:r>
-      </w:hyperlink>
-    </w:p>
-    <w:p>
-      <w:pPr>
-        <w:snapToGrid w:val="0"/>
-      </w:pPr>
-      <w:r>
-        <w:t>与《童年》并读，比较的是孩子得到的支持和仍然需要的生活条件。家庭暴力与纳粹迫害不能归为同一种经历。</w:t>
-      </w:r>
-    </w:p>
-    <w:p>
-      <w:pPr>
-        <w:pStyle w:val="Heading2"/>
-      </w:pPr>
-      <w:r>
-        <w:t>亚门的学校与同伴</w:t>
-      </w:r>
-    </w:p>
-    <w:p>
-      <w:pPr>
-        <w:snapToGrid w:val="0"/>
-      </w:pPr>
-      <w:r>
-        <w:t>联合国儿童基金会，Jane Courtney撰写，Hope amid the rubble – Restoring learning in the Gaza Strip，2024年9月10日。报道地点为加沙地带。亚门的母亲是教师，在家教他功课；他仍希望回学校，与同伴学习，生活中还需取水、捡柴。</w:t>
-      </w:r>
-    </w:p>
-    <w:p>
-      <w:pPr>
-        <w:snapToGrid w:val="0"/>
+      <w:pPr>
+        <w:pStyle w:val="Heading3"/>
+        <w:keepNext/>
+        <w:keepLines/>
+        <w:spacing w:line="320" w:lineRule="exact" w:after="60" w:before="180"/>
+      </w:pPr>
+      <w:r>
+        <w:rPr>
+          <w:sz w:val="22"/>
+        </w:rPr>
+        <w:t>UNICEF  Hope amid the rubble – Restoring learning in the Gaza Strip</w:t>
+      </w:r>
+    </w:p>
+    <w:p>
+      <w:pPr>
+        <w:keepNext/>
+        <w:keepLines/>
+        <w:spacing w:line="320" w:lineRule="exact" w:after="60"/>
+      </w:pPr>
+      <w:r>
+        <w:rPr>
+          <w:sz w:val="22"/>
+        </w:rPr>
+        <w:t>Jane Courtney  2024-09-10</w:t>
+      </w:r>
+    </w:p>
+    <w:p>
+      <w:pPr>
+        <w:keepNext/>
+        <w:keepLines/>
+        <w:spacing w:line="320" w:lineRule="exact" w:after="60"/>
       </w:pPr>
       <w:r>
         <w:rPr>
           <w:b/>
+          <w:sz w:val="22"/>
         </w:rPr>
-        <w:t xml:space="preserve">讲述边界  </w:t>
-      </w:r>
-      <w:r>
-        <w:t>这是一则2024年的历史报道，不能当作2026年的即时近况。来源未提供可靠年龄，本课不补写。中文内容为依据报道的概述，没有引号，不冒充采访直译。</w:t>
-      </w:r>
-    </w:p>
-    <w:p>
+        <w:t xml:space="preserve">文字身份  </w:t>
+      </w:r>
+      <w:r>
+        <w:rPr>
+          <w:sz w:val="22"/>
+        </w:rPr>
+        <w:t>有引号的两句是亚门采访短引的工作译文；其余为报道内容整理，不是逐字翻译。照片为亚门与父亲；不补写未报道的年龄。</w:t>
+      </w:r>
+    </w:p>
+    <w:p>
+      <w:pPr>
+        <w:keepNext/>
+        <w:keepLines/>
+        <w:spacing w:line="320" w:lineRule="exact" w:after="60"/>
+      </w:pPr>
+      <w:r>
+        <w:rPr>
+          <w:sz w:val="22"/>
+        </w:rPr>
+        <w:t xml:space="preserve">原始网页  </w:t>
+      </w:r>
       <w:hyperlink r:id="rId13">
         <w:r>
           <w:rPr>
-            <w:rFonts w:ascii="Noto Sans CJK SC" w:hAnsi="Noto Sans CJK SC" w:eastAsia="Noto Sans CJK SC"/>
-            <w:color w:val="18536B"/>
-            <w:sz w:val="24"/>
+            <w:color w:val="23637A"/>
             <w:u w:val="single"/>
+            <w:sz w:val="20"/>
           </w:rPr>
-          <w:t>UNICEF 亚门的学习报道</w:t>
+          <w:t>https://www.unicef.org/blog/hope-amid-rubble-restoring-learning-gaza-strip</w:t>
         </w:r>
       </w:hyperlink>
     </w:p>
     <w:p>
       <w:pPr>
-        <w:snapToGrid w:val="0"/>
-      </w:pPr>
-      <w:r>
-        <w:t>图像署名  UNICEF 2024。原图呈现亚门与父亲，不冒称图片中的成人为母亲。教师讲述母亲的支持，依据的是报道文字。</w:t>
-      </w:r>
-    </w:p>
-    <w:p>
-      <w:pPr>
-        <w:pStyle w:val="Heading2"/>
-      </w:pPr>
-      <w:r>
-        <w:t>瓦尔瓦拉的灯光与温暖</w:t>
-      </w:r>
-    </w:p>
-    <w:p>
-      <w:pPr>
-        <w:snapToGrid w:val="0"/>
-      </w:pPr>
-      <w:r>
-        <w:t>联合国儿童基金会，As winter bites, needs intensify for families in Ukraine，2022年12月19日。报道地点为乌克兰基辅地区布恰，瓦尔瓦拉在报道当时七岁。母亲为她点蜡烛读书；停电让家中失去灯光和温暖，她难以在黑暗中安稳入睡。</w:t>
-      </w:r>
-    </w:p>
-    <w:p>
-      <w:pPr>
-        <w:snapToGrid w:val="0"/>
+        <w:keepNext w:val="0"/>
+        <w:keepLines/>
+        <w:spacing w:line="320" w:lineRule="exact" w:after="60"/>
       </w:pPr>
       <w:r>
         <w:rPr>
           <w:b/>
+          <w:sz w:val="22"/>
         </w:rPr>
-        <w:t xml:space="preserve">讲述边界  </w:t>
-      </w:r>
-      <w:r>
-        <w:t>“七岁”是2022年报道时的年龄。“灯亮着的夜晚”“有光的夜晚”是课堂对生活条件的概括，不是加引号的儿童原话。该资料不能作为2026年的即时报道。</w:t>
-      </w:r>
-    </w:p>
-    <w:p>
+        <w:t xml:space="preserve">图像署名  </w:t>
+      </w:r>
+      <w:r>
+        <w:rPr>
+          <w:sz w:val="22"/>
+        </w:rPr>
+        <w:t>UNICEF 2024。照片中为亚门与父亲；报道里母亲在家教学，不将两者混淆。</w:t>
+      </w:r>
+    </w:p>
+    <w:p>
+      <w:pPr>
+        <w:pStyle w:val="Heading3"/>
+        <w:keepNext/>
+        <w:keepLines/>
+        <w:spacing w:line="320" w:lineRule="exact" w:after="60" w:before="180"/>
+      </w:pPr>
+      <w:r>
+        <w:rPr>
+          <w:sz w:val="22"/>
+        </w:rPr>
+        <w:t>UNICEF  As winter bites, needs intensify for families in Ukraine</w:t>
+      </w:r>
+    </w:p>
+    <w:p>
+      <w:pPr>
+        <w:keepNext/>
+        <w:keepLines/>
+        <w:spacing w:line="320" w:lineRule="exact" w:after="60"/>
+      </w:pPr>
+      <w:r>
+        <w:rPr>
+          <w:sz w:val="22"/>
+        </w:rPr>
+        <w:t>2022-12-19</w:t>
+      </w:r>
+    </w:p>
+    <w:p>
+      <w:pPr>
+        <w:keepNext/>
+        <w:keepLines/>
+        <w:spacing w:line="320" w:lineRule="exact" w:after="60"/>
+      </w:pPr>
+      <w:r>
+        <w:rPr>
+          <w:b/>
+          <w:sz w:val="22"/>
+        </w:rPr>
+        <w:t xml:space="preserve">文字身份  </w:t>
+      </w:r>
+      <w:r>
+        <w:rPr>
+          <w:sz w:val="22"/>
+        </w:rPr>
+        <w:t>有引号的两句是瓦尔瓦拉采访短引的工作译文；其余为报道内容整理。“七岁”为报道当时年龄；照片不是烛光阅读现场。</w:t>
+      </w:r>
+    </w:p>
+    <w:p>
+      <w:pPr>
+        <w:keepNext/>
+        <w:keepLines/>
+        <w:spacing w:line="320" w:lineRule="exact" w:after="60"/>
+      </w:pPr>
+      <w:r>
+        <w:rPr>
+          <w:sz w:val="22"/>
+        </w:rPr>
+        <w:t xml:space="preserve">原始网页  </w:t>
+      </w:r>
       <w:hyperlink r:id="rId14">
         <w:r>
           <w:rPr>
-            <w:rFonts w:ascii="Noto Sans CJK SC" w:hAnsi="Noto Sans CJK SC" w:eastAsia="Noto Sans CJK SC"/>
-            <w:color w:val="18536B"/>
-            <w:sz w:val="24"/>
+            <w:color w:val="23637A"/>
             <w:u w:val="single"/>
+            <w:sz w:val="20"/>
           </w:rPr>
-          <w:t>UNICEF 瓦尔瓦拉家庭的冬季生活报道</w:t>
+          <w:t>https://www.unicef.org/ukraine/en/stories/needs-intensify-for-families-in-ukraine</w:t>
         </w:r>
       </w:hyperlink>
     </w:p>
     <w:p>
       <w:pPr>
-        <w:snapToGrid w:val="0"/>
-      </w:pPr>
-      <w:r>
-        <w:t>图像署名  UNICEF。使用纪实原图，不把儿童重绘成幻想形象，不在照片上添加伤口、危险或虚构对白。</w:t>
-      </w:r>
-    </w:p>
-    <w:p>
-      <w:pPr>
-        <w:snapToGrid w:val="0"/>
-      </w:pPr>
-      <w:r>
-        <w:t>以上材料查验日期为2026年10月23日。所有来源身份和图像署名保存在教师资料中；学生投影专注当下阅读与画面。</w:t>
+        <w:keepNext w:val="0"/>
+        <w:keepLines/>
+        <w:spacing w:line="320" w:lineRule="exact" w:after="60"/>
+      </w:pPr>
+      <w:r>
+        <w:rPr>
+          <w:b/>
+          <w:sz w:val="22"/>
+        </w:rPr>
+        <w:t xml:space="preserve">图像署名  </w:t>
+      </w:r>
+      <w:r>
+        <w:rPr>
+          <w:sz w:val="22"/>
+        </w:rPr>
+        <w:t>UNICEF。使用瓦尔瓦拉与母亲的纪实照片；照片不是烛光阅读现场，不添加虚构对白或危险。</w:t>
       </w:r>
     </w:p>
     <w:p>
@@ -6186,7 +7012,7 @@
         <w:snapToGrid w:val="0"/>
       </w:pPr>
       <w:r>
-        <w:t>现实儿童泡泡由教师讲述，不再追问学生。若必须压缩，只保留每名儿童一个事实与一个仍需要的条件，接回原结语；不要临时加新数据或更多案例。38:00应进入退出卡，教师在书写期间停止讲解。</w:t>
+        <w:t>两份现实报道已各留90秒，其中两页独立阅读合计约70秒。教师只作短连接，不增加问答或重复读屏；完整阅读版不把这些页面压回原来的15秒。40:30应进入退出卡，教师在书写期间停止讲解。</w:t>
       </w:r>
     </w:p>
     <w:p>

</xml_diff>